<commit_message>
Explain what uv is rather than assuming it
'Python via uv' told students nothing unless they already knew the tool.
The syllabus, README, and lecture 1 now say that uv installs Python itself,
manages packages, replaces pip/venv/pyenv, and writes a uv.lock pinning
exact versions so the environment can be rebuilt.

Also spells out the renv/uv pairing in the week 1 outline: renv for R, uv
for Python, so an analysis still runs in two years.
</commit_message>
<xml_diff>
--- a/syllabus/mkt-699-Fall2026-revised.docx
+++ b/syllabus/mkt-699-Fall2026-revised.docx
@@ -460,7 +460,10 @@
         <w:pStyle w:val="Compact"/>
       </w:pPr>
       <w:r>
-        <w:t xml:space="preserve">Environment management and dependency pinning (</w:t>
+        <w:t xml:space="preserve">Environment management and dependency pinning:</w:t>
+      </w:r>
+      <w:r>
+        <w:t xml:space="preserve"> </w:t>
       </w:r>
       <w:r>
         <w:rPr>
@@ -469,7 +472,10 @@
         <w:t xml:space="preserve">renv</w:t>
       </w:r>
       <w:r>
-        <w:t xml:space="preserve">,</w:t>
+        <w:t xml:space="preserve"> </w:t>
+      </w:r>
+      <w:r>
+        <w:t xml:space="preserve">for R,</w:t>
       </w:r>
       <w:r>
         <w:t xml:space="preserve"> </w:t>
@@ -481,7 +487,10 @@
         <w:t xml:space="preserve">uv</w:t>
       </w:r>
       <w:r>
-        <w:t xml:space="preserve">), containers in brief</w:t>
+        <w:t xml:space="preserve"> </w:t>
+      </w:r>
+      <w:r>
+        <w:t xml:space="preserve">for Python, so an analysis still runs in two years. Containers in brief</w:t>
       </w:r>
     </w:p>
     <w:p>
@@ -4579,10 +4588,7 @@
         <w:t xml:space="preserve">Python</w:t>
       </w:r>
       <w:r>
-        <w:t xml:space="preserve"> </w:t>
-      </w:r>
-      <w:r>
-        <w:t xml:space="preserve">(via</w:t>
+        <w:t xml:space="preserve">, installed and managed with</w:t>
       </w:r>
       <w:r>
         <w:t xml:space="preserve"> </w:t>
@@ -4594,13 +4600,61 @@
         <w:t xml:space="preserve">uv</w:t>
       </w:r>
       <w:r>
-        <w:t xml:space="preserve">)</w:t>
-      </w:r>
-      <w:r>
-        <w:t xml:space="preserve"> </w:t>
-      </w:r>
-      <w:r>
-        <w:t xml:space="preserve">https://docs.astral.sh/uv/</w:t>
+        <w:t xml:space="preserve"> </w:t>
+      </w:r>
+      <w:r>
+        <w:t xml:space="preserve">https://docs.astral.sh/uv/ —</w:t>
+      </w:r>
+      <w:r>
+        <w:t xml:space="preserve"> </w:t>
+      </w:r>
+      <w:r>
+        <w:rPr>
+          <w:rStyle w:val="VerbatimChar"/>
+        </w:rPr>
+        <w:t xml:space="preserve">uv</w:t>
+      </w:r>
+      <w:r>
+        <w:t xml:space="preserve"> </w:t>
+      </w:r>
+      <w:r>
+        <w:t xml:space="preserve">installs Python for you and records the exact package versions your project used, so the environment can be rebuilt later. It replaces</w:t>
+      </w:r>
+      <w:r>
+        <w:t xml:space="preserve"> </w:t>
+      </w:r>
+      <w:r>
+        <w:rPr>
+          <w:rStyle w:val="VerbatimChar"/>
+        </w:rPr>
+        <w:t xml:space="preserve">pip</w:t>
+      </w:r>
+      <w:r>
+        <w:t xml:space="preserve">,</w:t>
+      </w:r>
+      <w:r>
+        <w:t xml:space="preserve"> </w:t>
+      </w:r>
+      <w:r>
+        <w:rPr>
+          <w:rStyle w:val="VerbatimChar"/>
+        </w:rPr>
+        <w:t xml:space="preserve">venv</w:t>
+      </w:r>
+      <w:r>
+        <w:t xml:space="preserve">, and</w:t>
+      </w:r>
+      <w:r>
+        <w:t xml:space="preserve"> </w:t>
+      </w:r>
+      <w:r>
+        <w:rPr>
+          <w:rStyle w:val="VerbatimChar"/>
+        </w:rPr>
+        <w:t xml:space="preserve">pyenv</w:t>
+      </w:r>
+      <w:r>
+        <w:t xml:space="preserve">.</w:t>
       </w:r>
     </w:p>
     <w:p>

</xml_diff>

<commit_message>
Syllabus docx: rebuild from markdown, all text in black
Regenerate the Word version so it picks up the identification-memo
definitions added in 356f07e, and render it entirely in black.

Pandoc's default reference styles left the 35 headings with no explicit
color, so Word resolved them through the theme's accent1 (4F81BD) and
rendered them blue. Build against a patched reference doc with explicit
black on heading/title styles and the theme accent/hlink entries zeroed,
plus --highlight-style=monochrome to drop the unused syntax-highlighting
palette. Every w:color in the result is now 000000.

Co-Authored-By: Claude Opus 5 (1M context) <noreply@anthropic.com>
</commit_message>
<xml_diff>
--- a/syllabus/mkt-699-Fall2026-revised.docx
+++ b/syllabus/mkt-699-Fall2026-revised.docx
@@ -2281,6 +2281,84 @@
         </w:tc>
       </w:tr>
     </w:tbl>
+    <w:p>
+      <w:pPr>
+        <w:pStyle w:val="BodyText"/>
+      </w:pPr>
+      <w:r>
+        <w:rPr>
+          <w:bCs/>
+          <w:b/>
+        </w:rPr>
+        <w:t xml:space="preserve">The identification memo.</w:t>
+      </w:r>
+      <w:r>
+        <w:t xml:space="preserve"> </w:t>
+      </w:r>
+      <w:r>
+        <w:t xml:space="preserve">The Week 3 deliverable is a memo of roughly 400–600 words, in the project repository, stating: the question; the data; the estimand; the variation that identifies it; what must be true for that variation to identify it; and what would break it. The last two are the memo. A memo that describes a dataset and a regression without naming an assumption that could fail has not done the assignment.</w:t>
+      </w:r>
+    </w:p>
+    <w:p>
+      <w:pPr>
+        <w:pStyle w:val="BodyText"/>
+      </w:pPr>
+      <w:r>
+        <w:rPr>
+          <w:bCs/>
+          <w:b/>
+        </w:rPr>
+        <w:t xml:space="preserve">The revision.</w:t>
+      </w:r>
+      <w:r>
+        <w:t xml:space="preserve"> </w:t>
+      </w:r>
+      <w:r>
+        <w:t xml:space="preserve">The Week 6 deliverable revisits the Week 3 memo in light of the validation study, and is due with the corrected estimates. The question it answers is whether measurement error changed what you are willing to claim. Mark changes from the Week 3 version so the revision is legible as a revision.</w:t>
+      </w:r>
+    </w:p>
+    <w:p>
+      <w:pPr>
+        <w:pStyle w:val="BodyText"/>
+      </w:pPr>
+      <w:r>
+        <w:t xml:space="preserve">Often it will change a great deal. If validation shows classifier error is correlated with your treatment or your covariates, the estimand may need narrowing, the identifying assumption may need to be restated conditional on the error structure, and the naive and corrected estimates may support different conclusions. That case is the point of Weeks 4 and 5, and the revision should be a rewrite.</w:t>
+      </w:r>
+    </w:p>
+    <w:p>
+      <w:pPr>
+        <w:pStyle w:val="BodyText"/>
+      </w:pPr>
+      <w:r>
+        <w:rPr>
+          <w:bCs/>
+          <w:b/>
+        </w:rPr>
+        <w:t xml:space="preserve">But not always.</w:t>
+      </w:r>
+      <w:r>
+        <w:t xml:space="preserve"> </w:t>
+      </w:r>
+      <w:r>
+        <w:t xml:space="preserve">If validation shows error that is modest and plausibly unrelated to the variation you exploit, and the corrected estimates track the naive ones, then the Week 3 argument survives and rewriting it would be theater. In that case the revision is a short note — a paragraph or two — reporting the validation result, showing the naive and corrected estimates side by side, and stating that the identifying assumption is unchanged and why. Say so plainly. An honest half-page that reports a stable design is worth more than three pages manufacturing a revision that the evidence does not call for. What is</w:t>
+      </w:r>
+      <w:r>
+        <w:t xml:space="preserve"> </w:t>
+      </w:r>
+      <w:r>
+        <w:rPr>
+          <w:iCs/>
+          <w:i/>
+        </w:rPr>
+        <w:t xml:space="preserve">not</w:t>
+      </w:r>
+      <w:r>
+        <w:t xml:space="preserve"> </w:t>
+      </w:r>
+      <w:r>
+        <w:t xml:space="preserve">acceptable is silence: every project reports the comparison, whether or not it moved anything.</w:t>
+      </w:r>
+    </w:p>
     <w:p>
       <w:pPr>
         <w:pStyle w:val="BodyText"/>
@@ -6638,6 +6716,7 @@
   <w:docDefaults>
     <w:rPrDefault>
       <w:rPr>
+        <w:color w:val="000000"/>
         <w:rFonts w:asciiTheme="minorHAnsi" w:cstheme="minorBidi" w:eastAsiaTheme="minorHAnsi" w:hAnsiTheme="minorHAnsi"/>
         <w:sz w:val="24"/>
         <w:szCs w:val="24"/>
@@ -6693,7 +6772,7 @@
       <w:rFonts w:asciiTheme="majorHAnsi" w:cstheme="majorBidi" w:eastAsiaTheme="majorEastAsia" w:hAnsiTheme="majorHAnsi"/>
       <w:b/>
       <w:bCs/>
-      <w:color w:themeColor="accent1" w:themeShade="B5" w:val="345A8A"/>
+      <w:color w:val="000000"/>
       <w:sz w:val="36"/>
       <w:szCs w:val="36"/>
     </w:rPr>
@@ -6710,6 +6789,7 @@
       <w:jc w:val="center"/>
     </w:pPr>
     <w:rPr>
+      <w:color w:val="000000"/>
       <w:sz w:val="30"/>
       <w:szCs w:val="30"/>
     </w:rPr>
@@ -6749,7 +6829,7 @@
       <w:sz w:val="20"/>
       <w:szCs w:val="20"/>
       <w:b/>
-      <w:color w:val="345A8A"/>
+      <w:color w:val="000000"/>
       &gt;
     </w:rPr>
   </w:style>
@@ -6792,7 +6872,7 @@
       <w:rFonts w:asciiTheme="majorHAnsi" w:cstheme="majorBidi" w:eastAsiaTheme="majorEastAsia" w:hAnsiTheme="majorHAnsi"/>
       <w:b/>
       <w:bCs/>
-      <w:color w:themeColor="accent1" w:val="4F81BD"/>
+      <w:color w:val="000000"/>
       <w:sz w:val="32"/>
       <w:szCs w:val="32"/>
     </w:rPr>
@@ -6814,7 +6894,7 @@
       <w:rFonts w:asciiTheme="majorHAnsi" w:cstheme="majorBidi" w:eastAsiaTheme="majorEastAsia" w:hAnsiTheme="majorHAnsi"/>
       <w:b/>
       <w:bCs/>
-      <w:color w:themeColor="accent1" w:val="4F81BD"/>
+      <w:color w:val="000000"/>
       <w:sz w:val="28"/>
       <w:szCs w:val="28"/>
     </w:rPr>
@@ -6836,7 +6916,7 @@
       <w:rFonts w:asciiTheme="majorHAnsi" w:cstheme="majorBidi" w:eastAsiaTheme="majorEastAsia" w:hAnsiTheme="majorHAnsi"/>
       <w:b/>
       <w:bCs/>
-      <w:color w:themeColor="accent1" w:val="4F81BD"/>
+      <w:color w:val="000000"/>
       <w:sz w:val="24"/>
       <w:szCs w:val="24"/>
     </w:rPr>
@@ -6858,7 +6938,7 @@
       <w:rFonts w:asciiTheme="majorHAnsi" w:cstheme="majorBidi" w:eastAsiaTheme="majorEastAsia" w:hAnsiTheme="majorHAnsi"/>
       <w:i/>
       <w:bCs/>
-      <w:color w:themeColor="accent1" w:val="4F81BD"/>
+      <w:color w:val="000000"/>
       <w:sz w:val="24"/>
       <w:szCs w:val="24"/>
     </w:rPr>
@@ -6879,7 +6959,7 @@
     <w:rPr>
       <w:rFonts w:asciiTheme="majorHAnsi" w:cstheme="majorBidi" w:eastAsiaTheme="majorEastAsia" w:hAnsiTheme="majorHAnsi"/>
       <w:iCs/>
-      <w:color w:themeColor="accent1" w:val="4F81BD"/>
+      <w:color w:val="000000"/>
       <w:sz w:val="24"/>
       <w:szCs w:val="24"/>
     </w:rPr>
@@ -6899,7 +6979,7 @@
     </w:pPr>
     <w:rPr>
       <w:rFonts w:asciiTheme="majorHAnsi" w:cstheme="majorBidi" w:eastAsiaTheme="majorEastAsia" w:hAnsiTheme="majorHAnsi"/>
-      <w:color w:themeColor="accent1" w:val="4F81BD"/>
+      <w:color w:val="000000"/>
       <w:sz w:val="24"/>
       <w:szCs w:val="24"/>
     </w:rPr>
@@ -6919,7 +6999,7 @@
     </w:pPr>
     <w:rPr>
       <w:rFonts w:asciiTheme="majorHAnsi" w:cstheme="majorBidi" w:eastAsiaTheme="majorEastAsia" w:hAnsiTheme="majorHAnsi"/>
-      <w:color w:themeColor="accent1" w:val="4F81BD"/>
+      <w:color w:val="000000"/>
       <w:sz w:val="24"/>
       <w:szCs w:val="24"/>
     </w:rPr>
@@ -6939,7 +7019,7 @@
     </w:pPr>
     <w:rPr>
       <w:rFonts w:asciiTheme="majorHAnsi" w:cstheme="majorBidi" w:eastAsiaTheme="majorEastAsia" w:hAnsiTheme="majorHAnsi"/>
-      <w:color w:themeColor="accent1" w:val="4F81BD"/>
+      <w:color w:val="000000"/>
       <w:sz w:val="24"/>
       <w:szCs w:val="24"/>
     </w:rPr>
@@ -6959,7 +7039,7 @@
     </w:pPr>
     <w:rPr>
       <w:rFonts w:asciiTheme="majorHAnsi" w:cstheme="majorBidi" w:eastAsiaTheme="majorEastAsia" w:hAnsiTheme="majorHAnsi"/>
-      <w:color w:themeColor="accent1" w:val="4F81BD"/>
+      <w:color w:val="000000"/>
       <w:sz w:val="24"/>
       <w:szCs w:val="24"/>
     </w:rPr>
@@ -7098,7 +7178,7 @@
     <w:name w:val="Hyperlink"/>
     <w:basedOn w:val="BodyTextChar"/>
     <w:rPr>
-      <w:color w:themeColor="accent1" w:val="4F81BD"/>
+      <w:color w:val="000000"/>
     </w:rPr>
   </w:style>
   <w:style w:styleId="TOCHeading" w:type="paragraph">
@@ -7116,7 +7196,7 @@
       <w:rFonts w:asciiTheme="majorHAnsi" w:cstheme="majorBidi" w:eastAsiaTheme="majorEastAsia" w:hAnsiTheme="majorHAnsi"/>
       <w:b w:val="0"/>
       <w:bCs w:val="0"/>
-      <w:color w:themeColor="accent1" w:themeShade="BF" w:val="365F91"/>
+      <w:color w:val="000000"/>
     </w:rPr>
   </w:style>
   <w:style w:type="paragraph" w:customStyle="1" w:styleId="SourceCode">
@@ -7131,7 +7211,6 @@
     <w:name w:val="KeywordTok"/>
     <w:basedOn w:val="VerbatimChar"/>
     <w:rPr>
-      <w:color w:val="007020"/>
       <w:b/>
     </w:rPr>
   </w:style>
@@ -7139,85 +7218,63 @@
     <w:name w:val="DataTypeTok"/>
     <w:basedOn w:val="VerbatimChar"/>
     <w:rPr>
-      <w:color w:val="902000"/>
+      <w:u/>
     </w:rPr>
   </w:style>
   <w:style w:type="character" w:customStyle="1" w:styleId="DecValTok">
     <w:name w:val="DecValTok"/>
     <w:basedOn w:val="VerbatimChar"/>
-    <w:rPr>
-      <w:color w:val="40a070"/>
-    </w:rPr>
+    <w:rPr/>
   </w:style>
   <w:style w:type="character" w:customStyle="1" w:styleId="BaseNTok">
     <w:name w:val="BaseNTok"/>
     <w:basedOn w:val="VerbatimChar"/>
-    <w:rPr>
-      <w:color w:val="40a070"/>
-    </w:rPr>
+    <w:rPr/>
   </w:style>
   <w:style w:type="character" w:customStyle="1" w:styleId="FloatTok">
     <w:name w:val="FloatTok"/>
     <w:basedOn w:val="VerbatimChar"/>
-    <w:rPr>
-      <w:color w:val="40a070"/>
-    </w:rPr>
+    <w:rPr/>
   </w:style>
   <w:style w:type="character" w:customStyle="1" w:styleId="ConstantTok">
     <w:name w:val="ConstantTok"/>
     <w:basedOn w:val="VerbatimChar"/>
-    <w:rPr>
-      <w:color w:val="880000"/>
-    </w:rPr>
+    <w:rPr/>
   </w:style>
   <w:style w:type="character" w:customStyle="1" w:styleId="CharTok">
     <w:name w:val="CharTok"/>
     <w:basedOn w:val="VerbatimChar"/>
-    <w:rPr>
-      <w:color w:val="4070a0"/>
-    </w:rPr>
+    <w:rPr/>
   </w:style>
   <w:style w:type="character" w:customStyle="1" w:styleId="SpecialCharTok">
     <w:name w:val="SpecialCharTok"/>
     <w:basedOn w:val="VerbatimChar"/>
-    <w:rPr>
-      <w:color w:val="4070a0"/>
-    </w:rPr>
+    <w:rPr/>
   </w:style>
   <w:style w:type="character" w:customStyle="1" w:styleId="StringTok">
     <w:name w:val="StringTok"/>
     <w:basedOn w:val="VerbatimChar"/>
-    <w:rPr>
-      <w:color w:val="4070a0"/>
-    </w:rPr>
+    <w:rPr/>
   </w:style>
   <w:style w:type="character" w:customStyle="1" w:styleId="VerbatimStringTok">
     <w:name w:val="VerbatimStringTok"/>
     <w:basedOn w:val="VerbatimChar"/>
-    <w:rPr>
-      <w:color w:val="4070a0"/>
-    </w:rPr>
+    <w:rPr/>
   </w:style>
   <w:style w:type="character" w:customStyle="1" w:styleId="SpecialStringTok">
     <w:name w:val="SpecialStringTok"/>
     <w:basedOn w:val="VerbatimChar"/>
-    <w:rPr>
-      <w:color w:val="bb6688"/>
-    </w:rPr>
+    <w:rPr/>
   </w:style>
   <w:style w:type="character" w:customStyle="1" w:styleId="ImportTok">
     <w:name w:val="ImportTok"/>
     <w:basedOn w:val="VerbatimChar"/>
-    <w:rPr>
-      <w:color w:val="008000"/>
-      <w:b/>
-    </w:rPr>
+    <w:rPr/>
   </w:style>
   <w:style w:type="character" w:customStyle="1" w:styleId="CommentTok">
     <w:name w:val="CommentTok"/>
     <w:basedOn w:val="VerbatimChar"/>
     <w:rPr>
-      <w:color w:val="60a0b0"/>
       <w:i/>
     </w:rPr>
   </w:style>
@@ -7225,7 +7282,6 @@
     <w:name w:val="DocumentationTok"/>
     <w:basedOn w:val="VerbatimChar"/>
     <w:rPr>
-      <w:color w:val="ba2121"/>
       <w:i/>
     </w:rPr>
   </w:style>
@@ -7233,8 +7289,6 @@
     <w:name w:val="AnnotationTok"/>
     <w:basedOn w:val="VerbatimChar"/>
     <w:rPr>
-      <w:color w:val="60a0b0"/>
-      <w:b/>
       <w:i/>
     </w:rPr>
   </w:style>
@@ -7242,53 +7296,40 @@
     <w:name w:val="CommentVarTok"/>
     <w:basedOn w:val="VerbatimChar"/>
     <w:rPr>
-      <w:color w:val="60a0b0"/>
-      <w:b/>
       <w:i/>
     </w:rPr>
   </w:style>
   <w:style w:type="character" w:customStyle="1" w:styleId="OtherTok">
     <w:name w:val="OtherTok"/>
     <w:basedOn w:val="VerbatimChar"/>
-    <w:rPr>
-      <w:color w:val="007020"/>
-    </w:rPr>
+    <w:rPr/>
   </w:style>
   <w:style w:type="character" w:customStyle="1" w:styleId="FunctionTok">
     <w:name w:val="FunctionTok"/>
     <w:basedOn w:val="VerbatimChar"/>
-    <w:rPr>
-      <w:color w:val="06287e"/>
-    </w:rPr>
+    <w:rPr/>
   </w:style>
   <w:style w:type="character" w:customStyle="1" w:styleId="VariableTok">
     <w:name w:val="VariableTok"/>
     <w:basedOn w:val="VerbatimChar"/>
-    <w:rPr>
-      <w:color w:val="19177c"/>
-    </w:rPr>
+    <w:rPr/>
   </w:style>
   <w:style w:type="character" w:customStyle="1" w:styleId="ControlFlowTok">
     <w:name w:val="ControlFlowTok"/>
     <w:basedOn w:val="VerbatimChar"/>
     <w:rPr>
-      <w:color w:val="007020"/>
       <w:b/>
     </w:rPr>
   </w:style>
   <w:style w:type="character" w:customStyle="1" w:styleId="OperatorTok">
     <w:name w:val="OperatorTok"/>
     <w:basedOn w:val="VerbatimChar"/>
-    <w:rPr>
-      <w:color w:val="666666"/>
-    </w:rPr>
+    <w:rPr/>
   </w:style>
   <w:style w:type="character" w:customStyle="1" w:styleId="BuiltInTok">
     <w:name w:val="BuiltInTok"/>
     <w:basedOn w:val="VerbatimChar"/>
-    <w:rPr>
-      <w:color w:val="008000"/>
-    </w:rPr>
+    <w:rPr/>
   </w:style>
   <w:style w:type="character" w:customStyle="1" w:styleId="ExtensionTok">
     <w:name w:val="ExtensionTok"/>
@@ -7299,15 +7340,13 @@
     <w:name w:val="PreprocessorTok"/>
     <w:basedOn w:val="VerbatimChar"/>
     <w:rPr>
-      <w:color w:val="bc7a00"/>
+      <w:b/>
     </w:rPr>
   </w:style>
   <w:style w:type="character" w:customStyle="1" w:styleId="AttributeTok">
     <w:name w:val="AttributeTok"/>
     <w:basedOn w:val="VerbatimChar"/>
-    <w:rPr>
-      <w:color w:val="7d9029"/>
-    </w:rPr>
+    <w:rPr/>
   </w:style>
   <w:style w:type="character" w:customStyle="1" w:styleId="RegionMarkerTok">
     <w:name w:val="RegionMarkerTok"/>
@@ -7318,8 +7357,6 @@
     <w:name w:val="InformationTok"/>
     <w:basedOn w:val="VerbatimChar"/>
     <w:rPr>
-      <w:color w:val="60a0b0"/>
-      <w:b/>
       <w:i/>
     </w:rPr>
   </w:style>
@@ -7327,8 +7364,6 @@
     <w:name w:val="WarningTok"/>
     <w:basedOn w:val="VerbatimChar"/>
     <w:rPr>
-      <w:color w:val="60a0b0"/>
-      <w:b/>
       <w:i/>
     </w:rPr>
   </w:style>
@@ -7336,7 +7371,6 @@
     <w:name w:val="AlertTok"/>
     <w:basedOn w:val="VerbatimChar"/>
     <w:rPr>
-      <w:color w:val="ff0000"/>
       <w:b/>
     </w:rPr>
   </w:style>
@@ -7344,7 +7378,6 @@
     <w:name w:val="ErrorTok"/>
     <w:basedOn w:val="VerbatimChar"/>
     <w:rPr>
-      <w:color w:val="ff0000"/>
       <w:b/>
     </w:rPr>
   </w:style>
@@ -7373,28 +7406,28 @@
         <a:srgbClr val="EEECE1"/>
       </a:lt2>
       <a:accent1>
-        <a:srgbClr val="4F81BD"/>
+        <a:srgbClr val="000000"/>
       </a:accent1>
       <a:accent2>
-        <a:srgbClr val="C0504D"/>
+        <a:srgbClr val="000000"/>
       </a:accent2>
       <a:accent3>
-        <a:srgbClr val="9BBB59"/>
+        <a:srgbClr val="000000"/>
       </a:accent3>
       <a:accent4>
-        <a:srgbClr val="8064A2"/>
+        <a:srgbClr val="000000"/>
       </a:accent4>
       <a:accent5>
-        <a:srgbClr val="4BACC6"/>
+        <a:srgbClr val="000000"/>
       </a:accent5>
       <a:accent6>
-        <a:srgbClr val="F79646"/>
+        <a:srgbClr val="000000"/>
       </a:accent6>
       <a:hlink>
-        <a:srgbClr val="0000FF"/>
+        <a:srgbClr val="000000"/>
       </a:hlink>
       <a:folHlink>
-        <a:srgbClr val="800080"/>
+        <a:srgbClr val="000000"/>
       </a:folHlink>
     </a:clrScheme>
     <a:fontScheme name="Office">

</xml_diff>

<commit_message>
Syllabus and README: lead the Week 6 revision with the requirement
The paragraph on the revised identification memo opened with the
exemption and buried the obligation, which invites students to skip the
comparison rather than report it briefly. Lead with the rule instead:
every project reports the naive and corrected estimates side by side,
then the short-note case follows as a concession.

Also drop "rewriting it would be theater" for plainer wording.

Rebuild the docx from the markdown, all text black.

Co-Authored-By: Claude Opus 5 (1M context) <noreply@anthropic.com>
</commit_message>
<xml_diff>
--- a/syllabus/mkt-699-Fall2026-revised.docx
+++ b/syllabus/mkt-699-Fall2026-revised.docx
@@ -2334,29 +2334,13 @@
           <w:bCs/>
           <w:b/>
         </w:rPr>
-        <w:t xml:space="preserve">But not always.</w:t>
-      </w:r>
-      <w:r>
-        <w:t xml:space="preserve"> </w:t>
-      </w:r>
-      <w:r>
-        <w:t xml:space="preserve">If validation shows error that is modest and plausibly unrelated to the variation you exploit, and the corrected estimates track the naive ones, then the Week 3 argument survives and rewriting it would be theater. In that case the revision is a short note — a paragraph or two — reporting the validation result, showing the naive and corrected estimates side by side, and stating that the identifying assumption is unchanged and why. Say so plainly. An honest half-page that reports a stable design is worth more than three pages manufacturing a revision that the evidence does not call for. What is</w:t>
-      </w:r>
-      <w:r>
-        <w:t xml:space="preserve"> </w:t>
-      </w:r>
-      <w:r>
-        <w:rPr>
-          <w:iCs/>
-          <w:i/>
-        </w:rPr>
-        <w:t xml:space="preserve">not</w:t>
-      </w:r>
-      <w:r>
-        <w:t xml:space="preserve"> </w:t>
-      </w:r>
-      <w:r>
-        <w:t xml:space="preserve">acceptable is silence: every project reports the comparison, whether or not it moved anything.</w:t>
+        <w:t xml:space="preserve">Every project reports the naive and corrected estimates side by side, whether or not they differ.</w:t>
+      </w:r>
+      <w:r>
+        <w:t xml:space="preserve"> </w:t>
+      </w:r>
+      <w:r>
+        <w:t xml:space="preserve">This is the part that is not optional. If the two estimates agree, and validation shows measurement error that is modest and plausibly unrelated to the variation you exploit, then the Week 3 argument stands. Report the validation result, show both estimates, state that the identifying assumption is unchanged, and explain why. A paragraph or two is enough. Do not pad it. A short memo that documents a stable design is worth more than a long one that manufactures a revision the evidence does not support.</w:t>
       </w:r>
     </w:p>
     <w:p>

</xml_diff>

<commit_message>
Syllabus: split the schedule by half, and back the Week 6 retraction case
Reorganize so the first half reads straight through: the Weeks 1-7
schedule now follows the first-half additional readings, and Weeks 8-15
moves down beside the second-half lecture outline and seminar readings.
The single Weeks 1-15 table became two.

The note on the retracted MIT paper promised a Week 6 discussion that
nothing in Week 6 delivered -- the paper appeared nowhere else in the
syllabus or the lecture. Add the retraction record as required reading:
MIT's May 2025 statement and the arXiv withdrawal, about two pages, with
an explicit instruction to read the record rather than the withdrawn
paper. Note arXiv's second ground for withdrawal, incomplete IRB
requirements, which the earlier note omitted.

Rebuild the docx, all text black.

Co-Authored-By: Claude Opus 5 (1M context) <noreply@anthropic.com>
</commit_message>
<xml_diff>
--- a/syllabus/mkt-699-Fall2026-revised.docx
+++ b/syllabus/mkt-699-Fall2026-revised.docx
@@ -2,7 +2,7 @@
 <file path=word/document.xml><?xml version="1.0" encoding="utf-8"?>
 <w:document xmlns:w="http://schemas.openxmlformats.org/wordprocessingml/2006/main" xmlns:m="http://schemas.openxmlformats.org/officeDocument/2006/math" xmlns:r="http://schemas.openxmlformats.org/officeDocument/2006/relationships" xmlns:o="urn:schemas-microsoft-com:office:office" xmlns:v="urn:schemas-microsoft-com:vml" xmlns:w10="urn:schemas-microsoft-com:office:word" xmlns:a="http://schemas.openxmlformats.org/drawingml/2006/main" xmlns:pic="http://schemas.openxmlformats.org/drawingml/2006/picture" xmlns:wp="http://schemas.openxmlformats.org/drawingml/2006/wordprocessingDrawing">
   <w:body>
-    <w:bookmarkStart w:id="45" w:name="mkt-699-empirical-methods-in-marketing"/>
+    <w:bookmarkStart w:id="46" w:name="mkt-699-empirical-methods-in-marketing"/>
     <w:p>
       <w:pPr>
         <w:pStyle w:val="Heading1"/>
@@ -1630,6 +1630,44 @@
           <w:i/>
         </w:rPr>
         <w:t xml:space="preserve">Papers:</w:t>
+      </w:r>
+    </w:p>
+    <w:p>
+      <w:pPr>
+        <w:numPr>
+          <w:ilvl w:val="0"/>
+          <w:numId w:val="1010"/>
+        </w:numPr>
+        <w:pStyle w:val="Compact"/>
+      </w:pPr>
+      <w:r>
+        <w:rPr>
+          <w:bCs/>
+          <w:b/>
+        </w:rPr>
+        <w:t xml:space="preserve">Required:</w:t>
+      </w:r>
+      <w:r>
+        <w:t xml:space="preserve"> </w:t>
+      </w:r>
+      <w:r>
+        <w:t xml:space="preserve">MIT Department of Economics (2025). Assuring an accurate research record. https://economics.mit.edu/news/assuring-accurate-research-record — and the arXiv withdrawal record for Toner-Rodgers,</w:t>
+      </w:r>
+      <w:r>
+        <w:t xml:space="preserve"> </w:t>
+      </w:r>
+      <w:r>
+        <w:rPr>
+          <w:iCs/>
+          <w:i/>
+        </w:rPr>
+        <w:t xml:space="preserve">Artificial intelligence, scientific discovery, and product innovation</w:t>
+      </w:r>
+      <w:r>
+        <w:t xml:space="preserve"> </w:t>
+      </w:r>
+      <w:r>
+        <w:t xml:space="preserve">(arXiv:2412.17866), https://arxiv.org/abs/2412.17866. [Two pages. Read the retraction record, not the paper: the paper is withdrawn and its results are void. We discuss the case, not the findings.]</w:t>
       </w:r>
     </w:p>
     <w:p>
@@ -2904,7 +2942,25 @@
         <w:t xml:space="preserve">arXiv:2412.17866</w:t>
       </w:r>
       <w:r>
-        <w:t xml:space="preserve">) was withdrawn after MIT stated it had no confidence in the provenance or validity of the data. It was publicly endorsed by prominent economists before the fraud surfaced. We will discuss it in Week 6 as a case study in why reproducible pipelines and data provenance are not bureaucratic overhead.</w:t>
+        <w:t xml:space="preserve">) is deliberately absent from the list above. In May 2025 MIT stated it had</w:t>
+      </w:r>
+      <w:r>
+        <w:t xml:space="preserve"> </w:t>
+      </w:r>
+      <w:r>
+        <w:t xml:space="preserve">“</w:t>
+      </w:r>
+      <w:r>
+        <w:t xml:space="preserve">no confidence in the provenance, reliability or validity of the data,</w:t>
+      </w:r>
+      <w:r>
+        <w:t xml:space="preserve">”</w:t>
+      </w:r>
+      <w:r>
+        <w:t xml:space="preserve"> </w:t>
+      </w:r>
+      <w:r>
+        <w:t xml:space="preserve">and arXiv withdrew it for data concerns and incomplete IRB requirements. It had been publicly endorsed by prominent economists first. We discuss it in Week 6 as a case study in why reproducible pipelines and data provenance are not bureaucratic overhead; the required reading there is the retraction record, not the paper.</w:t>
       </w:r>
     </w:p>
     <w:p>
@@ -2915,106 +2971,13 @@
       </w:r>
     </w:p>
     <w:bookmarkEnd w:id="32"/>
-    <w:bookmarkStart w:id="33" w:name="lecture-outline-second-half"/>
+    <w:bookmarkStart w:id="33" w:name="course-outline-and-schedule-first-half"/>
     <w:p>
       <w:pPr>
         <w:pStyle w:val="Heading2"/>
       </w:pPr>
       <w:r>
-        <w:t xml:space="preserve">Lecture Outline (Second Half)</w:t>
-      </w:r>
-    </w:p>
-    <w:p>
-      <w:pPr>
-        <w:pStyle w:val="FirstParagraph"/>
-      </w:pPr>
-      <w:r>
-        <w:t xml:space="preserve">In the second part of this class, we will cover the structural estimation of choice models. We will begin by comparing structural analysis with descriptive and reduced-form analysis and discussing when structural analysis is most appropriate, as well as its benefits and limitations. We will then introduce the basics of general model identification and estimation. Next, we will cover canonical choice models, with a main focus on single-agent static models. Topics include models of individual discrete choice, selection, unobserved heterogeneity, BLP, and consumer search. Depending on the progress, some topics may be cut, and additional topics may be added. There is no required textbook for this section of the course, which is primarily based on journal readings, but you may find the following references helpful as background material:</w:t>
-      </w:r>
-    </w:p>
-    <w:p>
-      <w:pPr>
-        <w:pStyle w:val="BodyText"/>
-      </w:pPr>
-      <w:r>
-        <w:t xml:space="preserve">Reiss, P. C., &amp; Wolak, F. A. (2007). Structural econometric modeling: Rationales and examples from industrial organization.</w:t>
-      </w:r>
-      <w:r>
-        <w:t xml:space="preserve"> </w:t>
-      </w:r>
-      <w:r>
-        <w:rPr>
-          <w:iCs/>
-          <w:i/>
-        </w:rPr>
-        <w:t xml:space="preserve">Handbook of Econometrics</w:t>
-      </w:r>
-      <w:r>
-        <w:t xml:space="preserve">, 6, 4277–4415.</w:t>
-      </w:r>
-    </w:p>
-    <w:p>
-      <w:pPr>
-        <w:pStyle w:val="BodyText"/>
-      </w:pPr>
-      <w:r>
-        <w:t xml:space="preserve">Train, K. E. (2009).</w:t>
-      </w:r>
-      <w:r>
-        <w:t xml:space="preserve"> </w:t>
-      </w:r>
-      <w:r>
-        <w:rPr>
-          <w:iCs/>
-          <w:i/>
-        </w:rPr>
-        <w:t xml:space="preserve">Discrete choice methods with simulation</w:t>
-      </w:r>
-      <w:r>
-        <w:t xml:space="preserve">. Cambridge University Press. (Free PDF at https://eml.berkeley.edu/books/choice2.html)</w:t>
-      </w:r>
-    </w:p>
-    <w:p>
-      <w:pPr>
-        <w:pStyle w:val="BodyText"/>
-      </w:pPr>
-      <w:r>
-        <w:t xml:space="preserve">Hortaçsu, A., &amp; Joo, J. (2023). Structural econometric modeling in industrial organization and quantitative marketing: theory and applications.</w:t>
-      </w:r>
-    </w:p>
-    <w:p>
-      <w:pPr>
-        <w:pStyle w:val="BodyText"/>
-      </w:pPr>
-      <w:r>
-        <w:t xml:space="preserve">In each week, we will discuss several papers on a particular topic. In most cases, the instructor will introduce the topics prior to the assigned readings. Most required papers will be pre-assigned to a student, who will be responsible for presenting the paper to the class with a specific focus and providing a platform for general discussion. All non-presenting students are also expected to read the assigned papers and actively participate in the discussion. Some required papers will be covered through lectures and instructor-led discussions. You will be evaluated on the level of your contribution to the discussion of each paper, even if you are not presenting.</w:t>
-      </w:r>
-      <w:r>
-        <w:t xml:space="preserve"> </w:t>
-      </w:r>
-      <w:r>
-        <w:rPr>
-          <w:iCs/>
-          <w:i/>
-        </w:rPr>
-        <w:t xml:space="preserve">Please note that attendance at all class sessions and reading of all required papers are mandatory.</w:t>
-      </w:r>
-    </w:p>
-    <w:p>
-      <w:r>
-        <w:pict>
-          <v:rect style="width:0;height:1.5pt" o:hralign="center" o:hrstd="t" o:hr="t"/>
-        </w:pict>
-      </w:r>
-    </w:p>
-    <w:bookmarkEnd w:id="33"/>
-    <w:bookmarkStart w:id="34" w:name="X8ceb92dbb9d929470f4e7a01ff00d448e63f1de"/>
-    <w:p>
-      <w:pPr>
-        <w:pStyle w:val="Heading2"/>
-      </w:pPr>
-      <w:r>
-        <w:t xml:space="preserve">Overall Course Outline and Proposed Schedule</w:t>
+        <w:t xml:space="preserve">Course Outline and Schedule (First Half)</w:t>
       </w:r>
     </w:p>
     <w:tbl>
@@ -3515,113 +3478,20 @@
       </w:tr>
     </w:tbl>
     <w:p>
-      <w:pPr>
-        <w:pStyle w:val="BodyText"/>
-      </w:pPr>
-      <w:r>
-        <w:t xml:space="preserve">| |</w:t>
-      </w:r>
-      <w:r>
-        <w:t xml:space="preserve"> </w:t>
-      </w:r>
-      <w:r>
-        <w:rPr>
-          <w:bCs/>
-          <w:b/>
-        </w:rPr>
-        <w:t xml:space="preserve">SECOND PART</w:t>
-      </w:r>
-      <w:r>
-        <w:t xml:space="preserve"> </w:t>
-      </w:r>
-      <w:r>
-        <w:t xml:space="preserve">| |</w:t>
-      </w:r>
-      <w:r>
-        <w:br/>
-      </w:r>
-      <w:r>
-        <w:t xml:space="preserve">8 | Oct 14 | Basics of Structural and Non-Structural Analysis: course overview; descriptive vs. reduced-form vs. structural; when and why structural analysis: benefits and limitations | |</w:t>
-      </w:r>
-      <w:r>
-        <w:br/>
-      </w:r>
-      <w:r>
-        <w:t xml:space="preserve">9 | Oct 21 | Basics of Model Identification and Estimation: model identification; estimation methods: (S)MLE, (S)GMM, NNE; empirical identification: sensitivity of estimates to moments | |</w:t>
-      </w:r>
-      <w:r>
-        <w:br/>
-      </w:r>
-      <w:r>
-        <w:t xml:space="preserve">10 | Oct 28 | Discrete Choice Models (Individual-Level Data): binary choices: logit, probit; multiple choices: (L)MNL, MNP, (L)Nested logit; ordered responses | Assignment 1 |</w:t>
-      </w:r>
-      <w:r>
-        <w:br/>
-      </w:r>
-      <w:r>
-        <w:t xml:space="preserve">11 | Nov 4 | Selection Models (Individual-Level Data): Tobit Type I–V; censored data, Heckman selection. Unobserved Heterogeneity: latent class; random coefficients | |</w:t>
-      </w:r>
-      <w:r>
-        <w:br/>
-      </w:r>
-      <w:r>
-        <w:t xml:space="preserve">12 | Nov 11 | Veterans Day Holiday (No Class) | |</w:t>
-      </w:r>
-      <w:r>
-        <w:br/>
-      </w:r>
-      <w:r>
-        <w:t xml:space="preserve">13 | Nov 18 | Demand for Differentiated Products (Aggregate Data): BLP fundamentals; BLP extension: long-tail market | Assignment 2 |</w:t>
-      </w:r>
-      <w:r>
-        <w:br/>
-      </w:r>
-      <w:r>
-        <w:t xml:space="preserve">14 | Nov 25 | Thanksgiving Holiday (No Class) | |</w:t>
-      </w:r>
-      <w:r>
-        <w:br/>
-      </w:r>
-      <w:r>
-        <w:t xml:space="preserve">15 | Dec 2 | Consumer Search Models: simultaneous and sequential search; identification with/without observed search | Assignment 3 |</w:t>
-      </w:r>
-    </w:p>
-    <w:p>
-      <w:pPr>
-        <w:pStyle w:val="BodyText"/>
-      </w:pPr>
-      <w:r>
-        <w:rPr>
-          <w:iCs/>
-          <w:i/>
-        </w:rPr>
-        <w:t xml:space="preserve">Note: In the second half, each student will have a turn presenting at least one of the papers assigned.</w:t>
-      </w:r>
-    </w:p>
-    <w:p>
       <w:r>
         <w:pict>
           <v:rect style="width:0;height:1.5pt" o:hralign="center" o:hrstd="t" o:hr="t"/>
         </w:pict>
       </w:r>
     </w:p>
-    <w:bookmarkEnd w:id="34"/>
-    <w:bookmarkStart w:id="41" w:name="seminar-readings-second-half"/>
+    <w:bookmarkEnd w:id="33"/>
+    <w:bookmarkStart w:id="34" w:name="lecture-outline-second-half"/>
     <w:p>
       <w:pPr>
         <w:pStyle w:val="Heading2"/>
       </w:pPr>
       <w:r>
-        <w:t xml:space="preserve">Seminar Readings (Second Half)</w:t>
-      </w:r>
-    </w:p>
-    <w:bookmarkStart w:id="35" w:name="X0ab25fbdb7500518a231435b617825f0b80ad47"/>
-    <w:p>
-      <w:pPr>
-        <w:pStyle w:val="Heading3"/>
-      </w:pPr>
-      <w:r>
-        <w:t xml:space="preserve">Week 8: Basics of Structural and Non-Structural Analysis</w:t>
+        <w:t xml:space="preserve">Lecture Outline (Second Half)</w:t>
       </w:r>
     </w:p>
     <w:p>
@@ -3629,797 +3499,75 @@
         <w:pStyle w:val="FirstParagraph"/>
       </w:pPr>
       <w:r>
-        <w:rPr>
-          <w:bCs/>
-          <w:b/>
-        </w:rPr>
-        <w:t xml:space="preserve">Required:</w:t>
-      </w:r>
-      <w:r>
-        <w:t xml:space="preserve"> </w:t>
-      </w:r>
-      <w:r>
-        <w:t xml:space="preserve">Reiss, P. C. (2011). Structural workshop paper—descriptive, structural, and experimental empirical methods in marketing research.</w:t>
-      </w:r>
-      <w:r>
-        <w:t xml:space="preserve"> </w:t>
-      </w:r>
-      <w:r>
-        <w:rPr>
-          <w:iCs/>
-          <w:i/>
-        </w:rPr>
-        <w:t xml:space="preserve">Marketing Science</w:t>
-      </w:r>
-      <w:r>
-        <w:t xml:space="preserve">, 30(6), 950–964.</w:t>
-      </w:r>
-    </w:p>
-    <w:p>
-      <w:pPr>
-        <w:pStyle w:val="BodyText"/>
-      </w:pPr>
-      <w:r>
-        <w:rPr>
-          <w:bCs/>
-          <w:b/>
-        </w:rPr>
-        <w:t xml:space="preserve">Required:</w:t>
-      </w:r>
-      <w:r>
-        <w:t xml:space="preserve"> </w:t>
-      </w:r>
-      <w:r>
-        <w:t xml:space="preserve">Rust, J. (2014). The limits of inference with theory: A review of Wolpin (2013).</w:t>
-      </w:r>
-      <w:r>
-        <w:t xml:space="preserve"> </w:t>
-      </w:r>
-      <w:r>
-        <w:rPr>
-          <w:iCs/>
-          <w:i/>
-        </w:rPr>
-        <w:t xml:space="preserve">Journal of Economic Literature</w:t>
-      </w:r>
-      <w:r>
-        <w:t xml:space="preserve">, 52(3), 820–850.</w:t>
-      </w:r>
-    </w:p>
-    <w:p>
-      <w:pPr>
-        <w:pStyle w:val="BodyText"/>
-      </w:pPr>
-      <w:r>
-        <w:t xml:space="preserve">Chintagunta, P., Erdem, T., Rossi, P. E., &amp; Wedel, M. (2006). Structural modeling in marketing: review and assessment.</w:t>
-      </w:r>
-      <w:r>
-        <w:t xml:space="preserve"> </w:t>
-      </w:r>
-      <w:r>
-        <w:rPr>
-          <w:iCs/>
-          <w:i/>
-        </w:rPr>
-        <w:t xml:space="preserve">Marketing Science</w:t>
-      </w:r>
-      <w:r>
-        <w:t xml:space="preserve">, 25(6), 604–616.</w:t>
-      </w:r>
-    </w:p>
-    <w:p>
-      <w:pPr>
-        <w:pStyle w:val="BodyText"/>
-      </w:pPr>
-      <w:r>
-        <w:t xml:space="preserve">Keane, M. P. (2010). Structural vs. atheoretic approaches to econometrics.</w:t>
-      </w:r>
-      <w:r>
-        <w:t xml:space="preserve"> </w:t>
-      </w:r>
-      <w:r>
-        <w:rPr>
-          <w:iCs/>
-          <w:i/>
-        </w:rPr>
-        <w:t xml:space="preserve">Journal of Econometrics</w:t>
-      </w:r>
-      <w:r>
-        <w:t xml:space="preserve">, 156(1), 3–20.</w:t>
-      </w:r>
-    </w:p>
-    <w:bookmarkEnd w:id="35"/>
-    <w:bookmarkStart w:id="36" w:name="Xce775c21b7168b611d9ace40905d91c869e0f86"/>
-    <w:p>
-      <w:pPr>
-        <w:pStyle w:val="Heading3"/>
-      </w:pPr>
-      <w:r>
-        <w:t xml:space="preserve">Week 9: Basics of Model Identification and Estimation</w:t>
-      </w:r>
-    </w:p>
-    <w:p>
-      <w:pPr>
-        <w:pStyle w:val="FirstParagraph"/>
-      </w:pPr>
-      <w:r>
-        <w:rPr>
-          <w:bCs/>
-          <w:b/>
-        </w:rPr>
-        <w:t xml:space="preserve">Required:</w:t>
-      </w:r>
-      <w:r>
-        <w:t xml:space="preserve"> </w:t>
-      </w:r>
-      <w:r>
-        <w:t xml:space="preserve">Andrews, I., Gentzkow, M., &amp; Shapiro, J. M. (2017). Measuring the sensitivity of parameter estimates to estimation moments.</w:t>
-      </w:r>
-      <w:r>
-        <w:t xml:space="preserve"> </w:t>
-      </w:r>
-      <w:r>
-        <w:rPr>
-          <w:iCs/>
-          <w:i/>
-        </w:rPr>
-        <w:t xml:space="preserve">The Quarterly Journal of Economics</w:t>
-      </w:r>
-      <w:r>
-        <w:t xml:space="preserve">, 132(4), 1553–1592.</w:t>
-      </w:r>
-    </w:p>
-    <w:p>
-      <w:pPr>
-        <w:pStyle w:val="BodyText"/>
-      </w:pPr>
-      <w:r>
-        <w:rPr>
-          <w:bCs/>
-          <w:b/>
-        </w:rPr>
-        <w:t xml:space="preserve">Required:</w:t>
-      </w:r>
-      <w:r>
-        <w:t xml:space="preserve"> </w:t>
-      </w:r>
-      <w:r>
-        <w:t xml:space="preserve">Wei, Y., &amp; Jiang, Z. (2025). Estimating parameters of structural models using neural networks.</w:t>
-      </w:r>
-      <w:r>
-        <w:t xml:space="preserve"> </w:t>
-      </w:r>
-      <w:r>
-        <w:rPr>
-          <w:iCs/>
-          <w:i/>
-        </w:rPr>
-        <w:t xml:space="preserve">Marketing Science</w:t>
-      </w:r>
-      <w:r>
-        <w:t xml:space="preserve">, 44(1), 102–128.</w:t>
-      </w:r>
-    </w:p>
-    <w:p>
-      <w:pPr>
-        <w:pStyle w:val="BodyText"/>
-      </w:pPr>
-      <w:r>
-        <w:t xml:space="preserve">Rothenberg, T. J. (1971). Identification in parametric models.</w:t>
-      </w:r>
-      <w:r>
-        <w:t xml:space="preserve"> </w:t>
-      </w:r>
-      <w:r>
-        <w:rPr>
-          <w:iCs/>
-          <w:i/>
-        </w:rPr>
-        <w:t xml:space="preserve">Econometrica</w:t>
-      </w:r>
-      <w:r>
-        <w:t xml:space="preserve">, 577–591.</w:t>
-      </w:r>
-    </w:p>
-    <w:p>
-      <w:pPr>
-        <w:pStyle w:val="BodyText"/>
-      </w:pPr>
-      <w:r>
-        <w:t xml:space="preserve">Lewbel, A. (2019). The identification zoo: Meanings of identification in econometrics.</w:t>
-      </w:r>
-      <w:r>
-        <w:t xml:space="preserve"> </w:t>
-      </w:r>
-      <w:r>
-        <w:rPr>
-          <w:iCs/>
-          <w:i/>
-        </w:rPr>
-        <w:t xml:space="preserve">Journal of Economic Literature</w:t>
-      </w:r>
-      <w:r>
-        <w:t xml:space="preserve">, 57(4), 835–903.</w:t>
-      </w:r>
-    </w:p>
-    <w:p>
-      <w:pPr>
-        <w:pStyle w:val="BodyText"/>
-      </w:pPr>
-      <w:r>
-        <w:t xml:space="preserve">Andrews, I., Gentzkow, M., &amp; Shapiro, J. M. (2020). On the informativeness of descriptive statistics for structural estimates.</w:t>
-      </w:r>
-      <w:r>
-        <w:t xml:space="preserve"> </w:t>
-      </w:r>
-      <w:r>
-        <w:rPr>
-          <w:iCs/>
-          <w:i/>
-        </w:rPr>
-        <w:t xml:space="preserve">Econometrica</w:t>
-      </w:r>
-      <w:r>
-        <w:t xml:space="preserve">, 88(6), 2231–2258.</w:t>
-      </w:r>
-    </w:p>
-    <w:bookmarkEnd w:id="36"/>
-    <w:bookmarkStart w:id="37" w:name="X8e014cc24d5306a9808b751ed997bd86e3b9da2"/>
-    <w:p>
-      <w:pPr>
-        <w:pStyle w:val="Heading3"/>
-      </w:pPr>
-      <w:r>
-        <w:t xml:space="preserve">Week 10: Discrete Choice Models (Individual-Level Data)</w:t>
-      </w:r>
-    </w:p>
-    <w:p>
-      <w:pPr>
-        <w:pStyle w:val="FirstParagraph"/>
-      </w:pPr>
-      <w:r>
-        <w:rPr>
-          <w:bCs/>
-          <w:b/>
-        </w:rPr>
-        <w:t xml:space="preserve">Required:</w:t>
-      </w:r>
-      <w:r>
-        <w:t xml:space="preserve"> </w:t>
-      </w:r>
-      <w:r>
-        <w:t xml:space="preserve">Guadagni, P. M., &amp; Little, J. D. (1983). A logit model of brand choice calibrated on scanner data.</w:t>
-      </w:r>
-      <w:r>
-        <w:t xml:space="preserve"> </w:t>
-      </w:r>
-      <w:r>
-        <w:rPr>
-          <w:iCs/>
-          <w:i/>
-        </w:rPr>
-        <w:t xml:space="preserve">Marketing Science</w:t>
-      </w:r>
-      <w:r>
-        <w:t xml:space="preserve">, 2(3), 203–238.</w:t>
-      </w:r>
-    </w:p>
-    <w:p>
-      <w:pPr>
-        <w:pStyle w:val="BodyText"/>
-      </w:pPr>
-      <w:r>
-        <w:rPr>
-          <w:bCs/>
-          <w:b/>
-        </w:rPr>
-        <w:t xml:space="preserve">Required:</w:t>
-      </w:r>
-      <w:r>
-        <w:t xml:space="preserve"> </w:t>
-      </w:r>
-      <w:r>
-        <w:t xml:space="preserve">Fader, P. S., &amp; Hardie, B. G. (1996). Modeling consumer choice among SKUs.</w:t>
-      </w:r>
-      <w:r>
-        <w:t xml:space="preserve"> </w:t>
-      </w:r>
-      <w:r>
-        <w:rPr>
-          <w:iCs/>
-          <w:i/>
-        </w:rPr>
-        <w:t xml:space="preserve">Journal of Marketing Research</w:t>
-      </w:r>
-      <w:r>
-        <w:t xml:space="preserve">, 33(4), 442–452.</w:t>
-      </w:r>
-    </w:p>
-    <w:p>
-      <w:pPr>
-        <w:pStyle w:val="BodyText"/>
-      </w:pPr>
-      <w:r>
-        <w:rPr>
-          <w:bCs/>
-          <w:b/>
-        </w:rPr>
-        <w:t xml:space="preserve">Required:</w:t>
-      </w:r>
-      <w:r>
-        <w:t xml:space="preserve"> </w:t>
-      </w:r>
-      <w:r>
-        <w:t xml:space="preserve">Sifringer, B., Lurkin, V., &amp; Alahi, A. (2020). Enhancing discrete choice models with representation learning.</w:t>
-      </w:r>
-      <w:r>
-        <w:t xml:space="preserve"> </w:t>
-      </w:r>
-      <w:r>
-        <w:rPr>
-          <w:iCs/>
-          <w:i/>
-        </w:rPr>
-        <w:t xml:space="preserve">Transportation Research Part B: Methodological</w:t>
-      </w:r>
-      <w:r>
-        <w:t xml:space="preserve">, 140, 236–261.</w:t>
-      </w:r>
-    </w:p>
-    <w:bookmarkEnd w:id="37"/>
-    <w:bookmarkStart w:id="38" w:name="X4c27de148a57c14bb78ed9f7beafbed05be6e57"/>
-    <w:p>
-      <w:pPr>
-        <w:pStyle w:val="Heading3"/>
-      </w:pPr>
-      <w:r>
-        <w:t xml:space="preserve">Week 11: Selection Models and Unobserved Heterogeneity (Individual-Level Data)</w:t>
-      </w:r>
-    </w:p>
-    <w:p>
-      <w:pPr>
-        <w:pStyle w:val="FirstParagraph"/>
-      </w:pPr>
-      <w:r>
-        <w:rPr>
-          <w:bCs/>
-          <w:b/>
-        </w:rPr>
-        <w:t xml:space="preserve">Required:</w:t>
-      </w:r>
-      <w:r>
-        <w:t xml:space="preserve"> </w:t>
-      </w:r>
-      <w:r>
-        <w:t xml:space="preserve">Gronau, R. (1973). The effect of children on the housewife’s value of time.</w:t>
-      </w:r>
-      <w:r>
-        <w:t xml:space="preserve"> </w:t>
-      </w:r>
-      <w:r>
-        <w:rPr>
-          <w:iCs/>
-          <w:i/>
-        </w:rPr>
-        <w:t xml:space="preserve">Journal of Political Economy</w:t>
-      </w:r>
-      <w:r>
-        <w:t xml:space="preserve">, 81(2, Part 2), S168–S199.</w:t>
-      </w:r>
-    </w:p>
-    <w:p>
-      <w:pPr>
-        <w:pStyle w:val="BodyText"/>
-      </w:pPr>
-      <w:r>
-        <w:rPr>
-          <w:bCs/>
-          <w:b/>
-        </w:rPr>
-        <w:t xml:space="preserve">Required:</w:t>
-      </w:r>
-      <w:r>
-        <w:t xml:space="preserve"> </w:t>
-      </w:r>
-      <w:r>
-        <w:t xml:space="preserve">Kamakura, W. A., &amp; Russell, G. J. (1989). A probabilistic choice model for market segmentation and elasticity structure.</w:t>
-      </w:r>
-      <w:r>
-        <w:t xml:space="preserve"> </w:t>
-      </w:r>
-      <w:r>
-        <w:rPr>
-          <w:iCs/>
-          <w:i/>
-        </w:rPr>
-        <w:t xml:space="preserve">Journal of Marketing Research</w:t>
-      </w:r>
-      <w:r>
-        <w:t xml:space="preserve">, 26(4), 379–390.</w:t>
-      </w:r>
-    </w:p>
-    <w:p>
-      <w:pPr>
-        <w:pStyle w:val="BodyText"/>
-      </w:pPr>
-      <w:r>
-        <w:t xml:space="preserve">Heckman, J. J. (1979). Sample selection bias as a specification error.</w:t>
-      </w:r>
-      <w:r>
-        <w:t xml:space="preserve"> </w:t>
-      </w:r>
-      <w:r>
-        <w:rPr>
-          <w:iCs/>
-          <w:i/>
-        </w:rPr>
-        <w:t xml:space="preserve">Econometrica</w:t>
-      </w:r>
-      <w:r>
-        <w:t xml:space="preserve">, 153–161.</w:t>
-      </w:r>
-    </w:p>
-    <w:p>
-      <w:pPr>
-        <w:pStyle w:val="BodyText"/>
-      </w:pPr>
-      <w:r>
-        <w:t xml:space="preserve">Amemiya, T. (1984). Tobit models: A survey.</w:t>
-      </w:r>
-      <w:r>
-        <w:t xml:space="preserve"> </w:t>
-      </w:r>
-      <w:r>
-        <w:rPr>
-          <w:iCs/>
-          <w:i/>
-        </w:rPr>
-        <w:t xml:space="preserve">Journal of Econometrics</w:t>
-      </w:r>
-      <w:r>
-        <w:t xml:space="preserve">, 24(1-2), 3–61.</w:t>
-      </w:r>
-    </w:p>
-    <w:bookmarkEnd w:id="38"/>
-    <w:bookmarkStart w:id="39" w:name="X56b81ba9909107ead1ec9219e3b957fc20f9788"/>
-    <w:p>
-      <w:pPr>
-        <w:pStyle w:val="Heading3"/>
-      </w:pPr>
-      <w:r>
-        <w:t xml:space="preserve">Week 13: Demand for Differentiated Products (Aggregate Data)</w:t>
-      </w:r>
-    </w:p>
-    <w:p>
-      <w:pPr>
-        <w:pStyle w:val="FirstParagraph"/>
-      </w:pPr>
-      <w:r>
-        <w:rPr>
-          <w:bCs/>
-          <w:b/>
-        </w:rPr>
-        <w:t xml:space="preserve">Required:</w:t>
-      </w:r>
-      <w:r>
-        <w:t xml:space="preserve"> </w:t>
-      </w:r>
-      <w:r>
-        <w:t xml:space="preserve">Berry, S. T. (1994). Estimating discrete-choice models of product differentiation.</w:t>
-      </w:r>
-      <w:r>
-        <w:t xml:space="preserve"> </w:t>
-      </w:r>
-      <w:r>
-        <w:rPr>
-          <w:iCs/>
-          <w:i/>
-        </w:rPr>
-        <w:t xml:space="preserve">The RAND Journal of Economics</w:t>
-      </w:r>
-      <w:r>
-        <w:t xml:space="preserve">, 242–262.</w:t>
-      </w:r>
-    </w:p>
-    <w:p>
-      <w:pPr>
-        <w:pStyle w:val="BodyText"/>
-      </w:pPr>
-      <w:r>
-        <w:rPr>
-          <w:bCs/>
-          <w:b/>
-        </w:rPr>
-        <w:t xml:space="preserve">Required:</w:t>
-      </w:r>
-      <w:r>
-        <w:t xml:space="preserve"> </w:t>
-      </w:r>
-      <w:r>
-        <w:t xml:space="preserve">Berry, S., Levinsohn, J., &amp; Pakes, A. (1995). Automobile prices in market equilibrium.</w:t>
-      </w:r>
-      <w:r>
-        <w:t xml:space="preserve"> </w:t>
-      </w:r>
-      <w:r>
-        <w:rPr>
-          <w:iCs/>
-          <w:i/>
-        </w:rPr>
-        <w:t xml:space="preserve">Econometrica</w:t>
-      </w:r>
-      <w:r>
-        <w:t xml:space="preserve">, 63(4), 841–890.</w:t>
-      </w:r>
-    </w:p>
-    <w:p>
-      <w:pPr>
-        <w:pStyle w:val="BodyText"/>
-      </w:pPr>
-      <w:r>
-        <w:rPr>
-          <w:bCs/>
-          <w:b/>
-        </w:rPr>
-        <w:t xml:space="preserve">Required:</w:t>
-      </w:r>
-      <w:r>
-        <w:t xml:space="preserve"> </w:t>
-      </w:r>
-      <w:r>
-        <w:t xml:space="preserve">Nevo, A. (2001). Measuring market power in the ready-to-eat cereal industry.</w:t>
-      </w:r>
-      <w:r>
-        <w:t xml:space="preserve"> </w:t>
-      </w:r>
-      <w:r>
-        <w:rPr>
-          <w:iCs/>
-          <w:i/>
-        </w:rPr>
-        <w:t xml:space="preserve">Econometrica</w:t>
-      </w:r>
-      <w:r>
-        <w:t xml:space="preserve">, 69(2), 307–342.</w:t>
-      </w:r>
-    </w:p>
-    <w:p>
-      <w:pPr>
-        <w:pStyle w:val="BodyText"/>
-      </w:pPr>
-      <w:r>
-        <w:rPr>
-          <w:bCs/>
-          <w:b/>
-        </w:rPr>
-        <w:t xml:space="preserve">Required:</w:t>
-      </w:r>
-      <w:r>
-        <w:t xml:space="preserve"> </w:t>
-      </w:r>
-      <w:r>
-        <w:t xml:space="preserve">Adam, H., He, P., &amp; Zheng, F. (2024). Machine learning for demand estimation in long tail markets.</w:t>
-      </w:r>
-      <w:r>
-        <w:t xml:space="preserve"> </w:t>
-      </w:r>
-      <w:r>
-        <w:rPr>
-          <w:iCs/>
-          <w:i/>
-        </w:rPr>
-        <w:t xml:space="preserve">Management Science</w:t>
-      </w:r>
-      <w:r>
-        <w:t xml:space="preserve">, 70(8), 5040–5065.</w:t>
-      </w:r>
-    </w:p>
-    <w:p>
-      <w:pPr>
-        <w:pStyle w:val="BodyText"/>
-      </w:pPr>
-      <w:r>
-        <w:t xml:space="preserve">Nevo, A. (2000). A practitioner’s guide to estimation of random-coefficients logit models of demand.</w:t>
-      </w:r>
-      <w:r>
-        <w:t xml:space="preserve"> </w:t>
-      </w:r>
-      <w:r>
-        <w:rPr>
-          <w:iCs/>
-          <w:i/>
-        </w:rPr>
-        <w:t xml:space="preserve">Journal of Economics &amp; Management Strategy</w:t>
-      </w:r>
-      <w:r>
-        <w:t xml:space="preserve">, 9(4), 513–548.</w:t>
-      </w:r>
-    </w:p>
-    <w:p>
-      <w:pPr>
-        <w:pStyle w:val="BodyText"/>
-      </w:pPr>
-      <w:r>
-        <w:t xml:space="preserve">Gandhi, A., Lu, Z., &amp; Shi, X. (2023). Estimating demand for differentiated products with zeroes in market share data.</w:t>
-      </w:r>
-      <w:r>
-        <w:t xml:space="preserve"> </w:t>
-      </w:r>
-      <w:r>
-        <w:rPr>
-          <w:iCs/>
-          <w:i/>
-        </w:rPr>
-        <w:t xml:space="preserve">Quantitative Economics</w:t>
-      </w:r>
-      <w:r>
-        <w:t xml:space="preserve">, 14(2), 381–418.</w:t>
-      </w:r>
-    </w:p>
-    <w:bookmarkEnd w:id="39"/>
-    <w:bookmarkStart w:id="40" w:name="week-15-consumer-search-models"/>
-    <w:p>
-      <w:pPr>
-        <w:pStyle w:val="Heading3"/>
-      </w:pPr>
-      <w:r>
-        <w:t xml:space="preserve">Week 15: Consumer Search Models</w:t>
-      </w:r>
-    </w:p>
-    <w:p>
-      <w:pPr>
-        <w:pStyle w:val="FirstParagraph"/>
-      </w:pPr>
-      <w:r>
-        <w:rPr>
-          <w:bCs/>
-          <w:b/>
-        </w:rPr>
-        <w:t xml:space="preserve">Required:</w:t>
-      </w:r>
-      <w:r>
-        <w:t xml:space="preserve"> </w:t>
-      </w:r>
-      <w:r>
-        <w:t xml:space="preserve">Mehta, N., Rajiv, S., &amp; Srinivasan, K. (2003). Price uncertainty and consumer search: A structural model of consideration set formation.</w:t>
-      </w:r>
-      <w:r>
-        <w:t xml:space="preserve"> </w:t>
-      </w:r>
-      <w:r>
-        <w:rPr>
-          <w:iCs/>
-          <w:i/>
-        </w:rPr>
-        <w:t xml:space="preserve">Marketing Science</w:t>
-      </w:r>
-      <w:r>
-        <w:t xml:space="preserve">, 22(1), 58–84.</w:t>
-      </w:r>
-    </w:p>
-    <w:p>
-      <w:pPr>
-        <w:pStyle w:val="BodyText"/>
-      </w:pPr>
-      <w:r>
-        <w:rPr>
-          <w:bCs/>
-          <w:b/>
-        </w:rPr>
-        <w:t xml:space="preserve">Required:</w:t>
-      </w:r>
-      <w:r>
-        <w:t xml:space="preserve"> </w:t>
-      </w:r>
-      <w:r>
-        <w:t xml:space="preserve">Ursu, R. M. (2018). The power of rankings: Quantifying the effect of rankings on online consumer search and purchase decisions.</w:t>
-      </w:r>
-      <w:r>
-        <w:t xml:space="preserve"> </w:t>
-      </w:r>
-      <w:r>
-        <w:rPr>
-          <w:iCs/>
-          <w:i/>
-        </w:rPr>
-        <w:t xml:space="preserve">Marketing Science</w:t>
-      </w:r>
-      <w:r>
-        <w:t xml:space="preserve">, 37(4), 530–552.</w:t>
-      </w:r>
-    </w:p>
-    <w:p>
-      <w:pPr>
-        <w:pStyle w:val="BodyText"/>
-      </w:pPr>
-      <w:r>
-        <w:rPr>
-          <w:bCs/>
-          <w:b/>
-        </w:rPr>
-        <w:t xml:space="preserve">Required:</w:t>
-      </w:r>
-      <w:r>
-        <w:t xml:space="preserve"> </w:t>
-      </w:r>
-      <w:r>
-        <w:t xml:space="preserve">Honka, E., &amp; Chintagunta, P. (2017). Simultaneous or sequential? Search strategies in the US auto insurance industry.</w:t>
-      </w:r>
-      <w:r>
-        <w:t xml:space="preserve"> </w:t>
-      </w:r>
-      <w:r>
-        <w:rPr>
-          <w:iCs/>
-          <w:i/>
-        </w:rPr>
-        <w:t xml:space="preserve">Marketing Science</w:t>
-      </w:r>
-      <w:r>
-        <w:t xml:space="preserve">, 36(1), 21–42.</w:t>
-      </w:r>
-    </w:p>
-    <w:p>
-      <w:pPr>
-        <w:pStyle w:val="BodyText"/>
-      </w:pPr>
-      <w:r>
-        <w:t xml:space="preserve">Hong, H., &amp; Shum, M. (2006). Using price distributions to estimate search costs.</w:t>
-      </w:r>
-      <w:r>
-        <w:t xml:space="preserve"> </w:t>
-      </w:r>
-      <w:r>
-        <w:rPr>
-          <w:iCs/>
-          <w:i/>
-        </w:rPr>
-        <w:t xml:space="preserve">The RAND Journal of Economics</w:t>
-      </w:r>
-      <w:r>
-        <w:t xml:space="preserve">, 37(2), 257–275.</w:t>
-      </w:r>
-    </w:p>
-    <w:p>
-      <w:pPr>
-        <w:pStyle w:val="BodyText"/>
-      </w:pPr>
-      <w:r>
-        <w:t xml:space="preserve">Honka, E. (2014). Quantifying search and switching costs in the US auto insurance industry.</w:t>
-      </w:r>
-      <w:r>
-        <w:t xml:space="preserve"> </w:t>
-      </w:r>
-      <w:r>
-        <w:rPr>
-          <w:iCs/>
-          <w:i/>
-        </w:rPr>
-        <w:t xml:space="preserve">The RAND Journal of Economics</w:t>
-      </w:r>
-      <w:r>
-        <w:t xml:space="preserve">, 45(4), 847–884.</w:t>
-      </w:r>
-    </w:p>
-    <w:p>
-      <w:pPr>
-        <w:pStyle w:val="BodyText"/>
-      </w:pPr>
-      <w:r>
-        <w:t xml:space="preserve">Santos, B. D. L., Hortaçsu, A., &amp; Wildenbeest, M. R. (2012). Testing models of consumer search using data on web browsing and purchasing behavior.</w:t>
-      </w:r>
-      <w:r>
-        <w:t xml:space="preserve"> </w:t>
-      </w:r>
-      <w:r>
-        <w:rPr>
-          <w:iCs/>
-          <w:i/>
-        </w:rPr>
-        <w:t xml:space="preserve">American Economic Review</w:t>
-      </w:r>
-      <w:r>
-        <w:t xml:space="preserve">, 102(6), 2955–2980.</w:t>
+        <w:t xml:space="preserve">In the second part of this class, we will cover the structural estimation of choice models. We will begin by comparing structural analysis with descriptive and reduced-form analysis and discussing when structural analysis is most appropriate, as well as its benefits and limitations. We will then introduce the basics of general model identification and estimation. Next, we will cover canonical choice models, with a main focus on single-agent static models. Topics include models of individual discrete choice, selection, unobserved heterogeneity, BLP, and consumer search. Depending on the progress, some topics may be cut, and additional topics may be added. There is no required textbook for this section of the course, which is primarily based on journal readings, but you may find the following references helpful as background material:</w:t>
+      </w:r>
+    </w:p>
+    <w:p>
+      <w:pPr>
+        <w:pStyle w:val="BodyText"/>
+      </w:pPr>
+      <w:r>
+        <w:t xml:space="preserve">Reiss, P. C., &amp; Wolak, F. A. (2007). Structural econometric modeling: Rationales and examples from industrial organization.</w:t>
+      </w:r>
+      <w:r>
+        <w:t xml:space="preserve"> </w:t>
+      </w:r>
+      <w:r>
+        <w:rPr>
+          <w:iCs/>
+          <w:i/>
+        </w:rPr>
+        <w:t xml:space="preserve">Handbook of Econometrics</w:t>
+      </w:r>
+      <w:r>
+        <w:t xml:space="preserve">, 6, 4277–4415.</w:t>
+      </w:r>
+    </w:p>
+    <w:p>
+      <w:pPr>
+        <w:pStyle w:val="BodyText"/>
+      </w:pPr>
+      <w:r>
+        <w:t xml:space="preserve">Train, K. E. (2009).</w:t>
+      </w:r>
+      <w:r>
+        <w:t xml:space="preserve"> </w:t>
+      </w:r>
+      <w:r>
+        <w:rPr>
+          <w:iCs/>
+          <w:i/>
+        </w:rPr>
+        <w:t xml:space="preserve">Discrete choice methods with simulation</w:t>
+      </w:r>
+      <w:r>
+        <w:t xml:space="preserve">. Cambridge University Press. (Free PDF at https://eml.berkeley.edu/books/choice2.html)</w:t>
+      </w:r>
+    </w:p>
+    <w:p>
+      <w:pPr>
+        <w:pStyle w:val="BodyText"/>
+      </w:pPr>
+      <w:r>
+        <w:t xml:space="preserve">Hortaçsu, A., &amp; Joo, J. (2023). Structural econometric modeling in industrial organization and quantitative marketing: theory and applications.</w:t>
+      </w:r>
+    </w:p>
+    <w:p>
+      <w:pPr>
+        <w:pStyle w:val="BodyText"/>
+      </w:pPr>
+      <w:r>
+        <w:t xml:space="preserve">In each week, we will discuss several papers on a particular topic. In most cases, the instructor will introduce the topics prior to the assigned readings. Most required papers will be pre-assigned to a student, who will be responsible for presenting the paper to the class with a specific focus and providing a platform for general discussion. All non-presenting students are also expected to read the assigned papers and actively participate in the discussion. Some required papers will be covered through lectures and instructor-led discussions. You will be evaluated on the level of your contribution to the discussion of each paper, even if you are not presenting.</w:t>
+      </w:r>
+      <w:r>
+        <w:t xml:space="preserve"> </w:t>
+      </w:r>
+      <w:r>
+        <w:rPr>
+          <w:iCs/>
+          <w:i/>
+        </w:rPr>
+        <w:t xml:space="preserve">Please note that attendance at all class sessions and reading of all required papers are mandatory.</w:t>
       </w:r>
     </w:p>
     <w:p>
@@ -4429,474 +3577,473 @@
         </w:pict>
       </w:r>
     </w:p>
-    <w:bookmarkEnd w:id="40"/>
-    <w:bookmarkEnd w:id="41"/>
-    <w:bookmarkStart w:id="42" w:name="Xcd16896efe5c0e37c48dbdf87d0e75ae69c53b6"/>
+    <w:bookmarkEnd w:id="34"/>
+    <w:bookmarkStart w:id="35" w:name="course-outline-and-schedule-second-half"/>
     <w:p>
       <w:pPr>
         <w:pStyle w:val="Heading2"/>
       </w:pPr>
       <w:r>
-        <w:t xml:space="preserve">Software Requirements and Online References</w:t>
-      </w:r>
-    </w:p>
-    <w:p>
-      <w:pPr>
-        <w:pStyle w:val="FirstParagraph"/>
-      </w:pPr>
-      <w:r>
-        <w:t xml:space="preserve">Each of these books/courses is freely available online:</w:t>
-      </w:r>
-    </w:p>
-    <w:p>
-      <w:pPr>
-        <w:numPr>
-          <w:ilvl w:val="0"/>
-          <w:numId w:val="1017"/>
-        </w:numPr>
-        <w:pStyle w:val="Compact"/>
-      </w:pPr>
-      <w:r>
-        <w:t xml:space="preserve">R for Marketing Research and Analytics</w:t>
-      </w:r>
-    </w:p>
-    <w:p>
-      <w:pPr>
-        <w:numPr>
-          <w:ilvl w:val="0"/>
-          <w:numId w:val="1017"/>
-        </w:numPr>
-        <w:pStyle w:val="Compact"/>
-      </w:pPr>
-      <w:r>
-        <w:t xml:space="preserve">Grant McDermott’s EC 607 course, to whom I dedicate a special thank you for sharing the course material</w:t>
-      </w:r>
-    </w:p>
-    <w:p>
-      <w:pPr>
-        <w:numPr>
-          <w:ilvl w:val="0"/>
-          <w:numId w:val="1017"/>
-        </w:numPr>
-        <w:pStyle w:val="Compact"/>
-      </w:pPr>
-      <w:r>
-        <w:rPr>
-          <w:iCs/>
-          <w:i/>
-        </w:rPr>
-        <w:t xml:space="preserve">Data Visualization: A Practical Introduction</w:t>
-      </w:r>
-      <w:r>
-        <w:t xml:space="preserve">, Kieran Healy</w:t>
-      </w:r>
-    </w:p>
-    <w:p>
-      <w:pPr>
-        <w:numPr>
-          <w:ilvl w:val="0"/>
-          <w:numId w:val="1017"/>
-        </w:numPr>
-        <w:pStyle w:val="Compact"/>
-      </w:pPr>
-      <w:r>
-        <w:rPr>
-          <w:iCs/>
-          <w:i/>
-        </w:rPr>
-        <w:t xml:space="preserve">R for Data Science</w:t>
-      </w:r>
-      <w:r>
-        <w:t xml:space="preserve">, Garrett Grolemund and Hadley Wickham</w:t>
-      </w:r>
-    </w:p>
-    <w:p>
-      <w:pPr>
-        <w:numPr>
-          <w:ilvl w:val="0"/>
-          <w:numId w:val="1017"/>
-        </w:numPr>
-        <w:pStyle w:val="Compact"/>
-      </w:pPr>
-      <w:r>
-        <w:rPr>
-          <w:iCs/>
-          <w:i/>
-        </w:rPr>
-        <w:t xml:space="preserve">Advanced R</w:t>
-      </w:r>
-      <w:r>
-        <w:t xml:space="preserve">, Hadley Wickham</w:t>
-      </w:r>
-    </w:p>
-    <w:p>
-      <w:pPr>
-        <w:numPr>
-          <w:ilvl w:val="0"/>
-          <w:numId w:val="1017"/>
-        </w:numPr>
-        <w:pStyle w:val="Compact"/>
-      </w:pPr>
-      <w:r>
-        <w:rPr>
-          <w:iCs/>
-          <w:i/>
-        </w:rPr>
-        <w:t xml:space="preserve">R Markdown: The Definitive Guide</w:t>
-      </w:r>
-      <w:r>
-        <w:t xml:space="preserve">, Yihui Xie, JJ Allaire, and Garrett Grolemund</w:t>
-      </w:r>
-    </w:p>
-    <w:p>
-      <w:pPr>
-        <w:numPr>
-          <w:ilvl w:val="0"/>
-          <w:numId w:val="1017"/>
-        </w:numPr>
-        <w:pStyle w:val="Compact"/>
-      </w:pPr>
-      <w:r>
-        <w:t xml:space="preserve">Parallel computing in R</w:t>
-      </w:r>
-    </w:p>
-    <w:p>
-      <w:pPr>
-        <w:numPr>
-          <w:ilvl w:val="0"/>
-          <w:numId w:val="1017"/>
-        </w:numPr>
-        <w:pStyle w:val="Compact"/>
-      </w:pPr>
-      <w:r>
-        <w:t xml:space="preserve">Awesome Reproducible Research (a curated list of reproducible research case studies, projects, tutorials, and media)</w:t>
-      </w:r>
-    </w:p>
-    <w:p>
-      <w:pPr>
-        <w:numPr>
-          <w:ilvl w:val="0"/>
-          <w:numId w:val="1017"/>
-        </w:numPr>
-        <w:pStyle w:val="Compact"/>
-      </w:pPr>
-      <w:r>
-        <w:t xml:space="preserve">https://pytorch.org/tutorials/beginner/deep_learning_60min_blitz.htm</w:t>
-      </w:r>
-    </w:p>
-    <w:p>
-      <w:pPr>
-        <w:numPr>
-          <w:ilvl w:val="0"/>
-          <w:numId w:val="1017"/>
-        </w:numPr>
-        <w:pStyle w:val="Compact"/>
-      </w:pPr>
-      <w:r>
-        <w:t xml:space="preserve">An accessible introduction to PyTorch: https://cs230.stanford.edu/blog/pytorch/#models-in-pytorch</w:t>
-      </w:r>
-    </w:p>
-    <w:p>
-      <w:pPr>
-        <w:pStyle w:val="FirstParagraph"/>
-      </w:pPr>
-      <w:r>
-        <w:rPr>
-          <w:bCs/>
-          <w:b/>
-        </w:rPr>
-        <w:t xml:space="preserve">VS Code</w:t>
-      </w:r>
-      <w:r>
-        <w:t xml:space="preserve"> </w:t>
-      </w:r>
-      <w:r>
-        <w:t xml:space="preserve">(the standard editor for the first half of this course)</w:t>
-      </w:r>
-      <w:r>
-        <w:t xml:space="preserve"> </w:t>
-      </w:r>
-      <w:r>
-        <w:t xml:space="preserve">https://code.visualstudio.com, install the R, Python, Remote-SSH, and Quarto extensions.</w:t>
-      </w:r>
-    </w:p>
-    <w:p>
-      <w:pPr>
-        <w:pStyle w:val="BodyText"/>
-      </w:pPr>
-      <w:r>
-        <w:rPr>
-          <w:bCs/>
-          <w:b/>
-        </w:rPr>
-        <w:t xml:space="preserve">R</w:t>
-      </w:r>
-      <w:r>
-        <w:t xml:space="preserve"> </w:t>
-      </w:r>
-      <w:r>
-        <w:t xml:space="preserve">https://www.r-project.org/</w:t>
-      </w:r>
-    </w:p>
-    <w:p>
-      <w:pPr>
-        <w:pStyle w:val="BodyText"/>
-      </w:pPr>
-      <w:r>
-        <w:rPr>
-          <w:bCs/>
-          <w:b/>
-        </w:rPr>
-        <w:t xml:space="preserve">Python</w:t>
-      </w:r>
-      <w:r>
-        <w:t xml:space="preserve">, installed and managed with</w:t>
-      </w:r>
-      <w:r>
-        <w:t xml:space="preserve"> </w:t>
-      </w:r>
-      <w:r>
-        <w:rPr>
-          <w:rStyle w:val="VerbatimChar"/>
-        </w:rPr>
-        <w:t xml:space="preserve">uv</w:t>
-      </w:r>
-      <w:r>
-        <w:t xml:space="preserve"> </w:t>
-      </w:r>
-      <w:r>
-        <w:t xml:space="preserve">https://docs.astral.sh/uv/ —</w:t>
-      </w:r>
-      <w:r>
-        <w:t xml:space="preserve"> </w:t>
-      </w:r>
-      <w:r>
-        <w:rPr>
-          <w:rStyle w:val="VerbatimChar"/>
-        </w:rPr>
-        <w:t xml:space="preserve">uv</w:t>
-      </w:r>
-      <w:r>
-        <w:t xml:space="preserve"> </w:t>
-      </w:r>
-      <w:r>
-        <w:t xml:space="preserve">installs Python for you and records the exact package versions your project used, so the environment can be rebuilt later. It replaces</w:t>
-      </w:r>
-      <w:r>
-        <w:t xml:space="preserve"> </w:t>
-      </w:r>
-      <w:r>
-        <w:rPr>
-          <w:rStyle w:val="VerbatimChar"/>
-        </w:rPr>
-        <w:t xml:space="preserve">pip</w:t>
-      </w:r>
-      <w:r>
-        <w:t xml:space="preserve">,</w:t>
-      </w:r>
-      <w:r>
-        <w:t xml:space="preserve"> </w:t>
-      </w:r>
-      <w:r>
-        <w:rPr>
-          <w:rStyle w:val="VerbatimChar"/>
-        </w:rPr>
-        <w:t xml:space="preserve">venv</w:t>
-      </w:r>
-      <w:r>
-        <w:t xml:space="preserve">, and</w:t>
-      </w:r>
-      <w:r>
-        <w:t xml:space="preserve"> </w:t>
-      </w:r>
-      <w:r>
-        <w:rPr>
-          <w:rStyle w:val="VerbatimChar"/>
-        </w:rPr>
-        <w:t xml:space="preserve">pyenv</w:t>
-      </w:r>
-      <w:r>
-        <w:t xml:space="preserve">.</w:t>
-      </w:r>
-    </w:p>
-    <w:p>
-      <w:pPr>
-        <w:pStyle w:val="BodyText"/>
-      </w:pPr>
-      <w:r>
-        <w:rPr>
-          <w:bCs/>
-          <w:b/>
-        </w:rPr>
-        <w:t xml:space="preserve">Git and GitHub</w:t>
-      </w:r>
-      <w:r>
-        <w:t xml:space="preserve"> </w:t>
-      </w:r>
-      <w:r>
-        <w:t xml:space="preserve">https://git-scm.com/downloads · https://github.com/</w:t>
-      </w:r>
-    </w:p>
-    <w:p>
-      <w:pPr>
-        <w:pStyle w:val="BodyText"/>
-      </w:pPr>
-      <w:r>
-        <w:rPr>
-          <w:bCs/>
-          <w:b/>
-        </w:rPr>
-        <w:t xml:space="preserve">SQL client</w:t>
-      </w:r>
-      <w:r>
-        <w:t xml:space="preserve"> </w:t>
-      </w:r>
-      <w:r>
-        <w:t xml:space="preserve">(for browsing the course database directly)</w:t>
-      </w:r>
-      <w:r>
-        <w:t xml:space="preserve"> </w:t>
-      </w:r>
-      <w:r>
-        <w:t xml:space="preserve">Mac: https://sequel-ace.com/ · Windows: https://www.mysql.com/products/workbench/</w:t>
-      </w:r>
-    </w:p>
-    <w:p>
-      <w:pPr>
-        <w:pStyle w:val="BodyText"/>
-      </w:pPr>
-      <w:r>
-        <w:rPr>
-          <w:bCs/>
-          <w:b/>
-        </w:rPr>
-        <w:t xml:space="preserve">DuckDB</w:t>
-      </w:r>
-      <w:r>
-        <w:t xml:space="preserve"> </w:t>
-      </w:r>
-      <w:r>
-        <w:t xml:space="preserve">https://duckdb.org/</w:t>
-      </w:r>
-    </w:p>
-    <w:p>
-      <w:pPr>
-        <w:pStyle w:val="BodyText"/>
-      </w:pPr>
-      <w:r>
-        <w:rPr>
-          <w:bCs/>
-          <w:b/>
-        </w:rPr>
-        <w:t xml:space="preserve">Course servers</w:t>
-      </w:r>
-      <w:r>
-        <w:t xml:space="preserve"> </w:t>
-      </w:r>
-      <w:r>
-        <w:t xml:space="preserve">(first half; USC network or VPN required)</w:t>
-      </w:r>
-      <w:r>
-        <w:t xml:space="preserve"> </w:t>
-      </w:r>
-      <w:r>
-        <w:t xml:space="preserve">Two Marshall research machines; addresses distributed in class. Connect with VS Code Remote-SSH.</w:t>
-      </w:r>
-    </w:p>
-    <w:p>
-      <w:pPr>
-        <w:pStyle w:val="BodyText"/>
-      </w:pPr>
-      <w:r>
-        <w:rPr>
-          <w:bCs/>
-          <w:b/>
-        </w:rPr>
-        <w:t xml:space="preserve">AI tools</w:t>
-      </w:r>
-      <w:r>
-        <w:t xml:space="preserve"> </w:t>
-      </w:r>
-      <w:r>
-        <w:t xml:space="preserve">(accounts required; the instructor will provide guidance on access in Week 1)</w:t>
-      </w:r>
-      <w:r>
-        <w:t xml:space="preserve"> </w:t>
-      </w:r>
-      <w:r>
-        <w:t xml:space="preserve">- Claude and Claude Code: https://claude.ai · https://claude.com/claude-code</w:t>
-      </w:r>
-      <w:r>
-        <w:t xml:space="preserve"> </w:t>
-      </w:r>
-      <w:r>
-        <w:t xml:space="preserve">- Anthropic API: https://docs.anthropic.com</w:t>
-      </w:r>
-      <w:r>
-        <w:t xml:space="preserve"> </w:t>
-      </w:r>
-      <w:r>
-        <w:t xml:space="preserve">- OpenAI API and Codex: https://platform.openai.com</w:t>
-      </w:r>
-      <w:r>
-        <w:t xml:space="preserve"> </w:t>
-      </w:r>
-      <w:r>
-        <w:t xml:space="preserve">- Cursor: https://cursor.com</w:t>
-      </w:r>
-    </w:p>
-    <w:p>
-      <w:pPr>
-        <w:pStyle w:val="BodyText"/>
-      </w:pPr>
-      <w:r>
-        <w:rPr>
-          <w:bCs/>
-          <w:b/>
-        </w:rPr>
-        <w:t xml:space="preserve">Statistical packages for generated-variable inference</w:t>
-      </w:r>
-      <w:r>
-        <w:t xml:space="preserve"> </w:t>
-      </w:r>
-      <w:r>
-        <w:t xml:space="preserve">-</w:t>
-      </w:r>
-      <w:r>
-        <w:t xml:space="preserve"> </w:t>
-      </w:r>
-      <w:r>
-        <w:rPr>
-          <w:rStyle w:val="VerbatimChar"/>
-        </w:rPr>
-        <w:t xml:space="preserve">dsl</w:t>
-      </w:r>
-      <w:r>
-        <w:t xml:space="preserve"> </w:t>
-      </w:r>
-      <w:r>
-        <w:t xml:space="preserve">(design-based supervised learning, R): https://naokiegami.com/dsl/</w:t>
-      </w:r>
-      <w:r>
-        <w:t xml:space="preserve"> </w:t>
-      </w:r>
-      <w:r>
-        <w:t xml:space="preserve">-</w:t>
-      </w:r>
-      <w:r>
-        <w:t xml:space="preserve"> </w:t>
-      </w:r>
-      <w:r>
-        <w:rPr>
-          <w:rStyle w:val="VerbatimChar"/>
-        </w:rPr>
-        <w:t xml:space="preserve">ppi_py</w:t>
-      </w:r>
-      <w:r>
-        <w:t xml:space="preserve"> </w:t>
-      </w:r>
-      <w:r>
-        <w:t xml:space="preserve">(prediction-powered inference, Python): https://github.com/aangelopoulos/ppi_py</w:t>
+        <w:t xml:space="preserve">Course Outline and Schedule (Second Half)</w:t>
+      </w:r>
+    </w:p>
+    <w:tbl>
+      <w:tblPr>
+        <w:tblStyle w:val="Table"/>
+        <w:tblW w:type="pct" w:w="5000"/>
+        <w:tblLook w:firstRow="1" w:lastRow="0" w:firstColumn="0" w:lastColumn="0" w:noHBand="0" w:noVBand="0" w:val="0020"/>
+        <w:jc w:val="start"/>
+      </w:tblPr>
+      <w:tblGrid>
+        <w:gridCol w:w="1980"/>
+        <w:gridCol w:w="1980"/>
+        <w:gridCol w:w="1980"/>
+        <w:gridCol w:w="1980"/>
+      </w:tblGrid>
+      <w:tr>
+        <w:trPr>
+          <w:tblHeader w:val="true"/>
+        </w:trPr>
+        <w:tc>
+          <w:tcPr/>
+          <w:p>
+            <w:pPr>
+              <w:pStyle w:val="Compact"/>
+              <w:jc w:val="left"/>
+            </w:pPr>
+            <w:r>
+              <w:t xml:space="preserve">Week</w:t>
+            </w:r>
+          </w:p>
+        </w:tc>
+        <w:tc>
+          <w:tcPr/>
+          <w:p>
+            <w:pPr>
+              <w:pStyle w:val="Compact"/>
+              <w:jc w:val="left"/>
+            </w:pPr>
+            <w:r>
+              <w:t xml:space="preserve">Date</w:t>
+            </w:r>
+          </w:p>
+        </w:tc>
+        <w:tc>
+          <w:tcPr/>
+          <w:p>
+            <w:pPr>
+              <w:pStyle w:val="Compact"/>
+              <w:jc w:val="left"/>
+            </w:pPr>
+            <w:r>
+              <w:t xml:space="preserve">Topic</w:t>
+            </w:r>
+          </w:p>
+        </w:tc>
+        <w:tc>
+          <w:tcPr/>
+          <w:p>
+            <w:pPr>
+              <w:pStyle w:val="Compact"/>
+              <w:jc w:val="left"/>
+            </w:pPr>
+            <w:r>
+              <w:t xml:space="preserve">Deliverable</w:t>
+            </w:r>
+          </w:p>
+        </w:tc>
+      </w:tr>
+      <w:tr>
+        <w:tc>
+          <w:tcPr/>
+          <w:p>
+            <w:pPr>
+              <w:pStyle w:val="Compact"/>
+              <w:jc w:val="left"/>
+            </w:pPr>
+            <w:r>
+              <w:t xml:space="preserve">8</w:t>
+            </w:r>
+          </w:p>
+        </w:tc>
+        <w:tc>
+          <w:tcPr/>
+          <w:p>
+            <w:pPr>
+              <w:pStyle w:val="Compact"/>
+              <w:jc w:val="left"/>
+            </w:pPr>
+            <w:r>
+              <w:t xml:space="preserve">Oct 14</w:t>
+            </w:r>
+          </w:p>
+        </w:tc>
+        <w:tc>
+          <w:tcPr/>
+          <w:p>
+            <w:pPr>
+              <w:pStyle w:val="Compact"/>
+              <w:jc w:val="left"/>
+            </w:pPr>
+            <w:r>
+              <w:t xml:space="preserve">Basics of Structural and Non-Structural Analysis: course overview; descriptive vs. reduced-form vs. structural; when and why structural analysis: benefits and limitations</w:t>
+            </w:r>
+          </w:p>
+        </w:tc>
+        <w:tc>
+          <w:tcPr/>
+          <w:p>
+            <w:pPr>
+              <w:pStyle w:val="Compact"/>
+            </w:pPr>
+          </w:p>
+        </w:tc>
+      </w:tr>
+      <w:tr>
+        <w:tc>
+          <w:tcPr/>
+          <w:p>
+            <w:pPr>
+              <w:pStyle w:val="Compact"/>
+              <w:jc w:val="left"/>
+            </w:pPr>
+            <w:r>
+              <w:t xml:space="preserve">9</w:t>
+            </w:r>
+          </w:p>
+        </w:tc>
+        <w:tc>
+          <w:tcPr/>
+          <w:p>
+            <w:pPr>
+              <w:pStyle w:val="Compact"/>
+              <w:jc w:val="left"/>
+            </w:pPr>
+            <w:r>
+              <w:t xml:space="preserve">Oct 21</w:t>
+            </w:r>
+          </w:p>
+        </w:tc>
+        <w:tc>
+          <w:tcPr/>
+          <w:p>
+            <w:pPr>
+              <w:pStyle w:val="Compact"/>
+              <w:jc w:val="left"/>
+            </w:pPr>
+            <w:r>
+              <w:t xml:space="preserve">Basics of Model Identification and Estimation: model identification; estimation methods: (S)MLE, (S)GMM, NNE; empirical identification: sensitivity of estimates to moments</w:t>
+            </w:r>
+          </w:p>
+        </w:tc>
+        <w:tc>
+          <w:tcPr/>
+          <w:p>
+            <w:pPr>
+              <w:pStyle w:val="Compact"/>
+            </w:pPr>
+          </w:p>
+        </w:tc>
+      </w:tr>
+      <w:tr>
+        <w:tc>
+          <w:tcPr/>
+          <w:p>
+            <w:pPr>
+              <w:pStyle w:val="Compact"/>
+              <w:jc w:val="left"/>
+            </w:pPr>
+            <w:r>
+              <w:t xml:space="preserve">10</w:t>
+            </w:r>
+          </w:p>
+        </w:tc>
+        <w:tc>
+          <w:tcPr/>
+          <w:p>
+            <w:pPr>
+              <w:pStyle w:val="Compact"/>
+              <w:jc w:val="left"/>
+            </w:pPr>
+            <w:r>
+              <w:t xml:space="preserve">Oct 28</w:t>
+            </w:r>
+          </w:p>
+        </w:tc>
+        <w:tc>
+          <w:tcPr/>
+          <w:p>
+            <w:pPr>
+              <w:pStyle w:val="Compact"/>
+              <w:jc w:val="left"/>
+            </w:pPr>
+            <w:r>
+              <w:t xml:space="preserve">Discrete Choice Models (Individual-Level Data): binary choices: logit, probit; multiple choices: (L)MNL, MNP, (L)Nested logit; ordered responses</w:t>
+            </w:r>
+          </w:p>
+        </w:tc>
+        <w:tc>
+          <w:tcPr/>
+          <w:p>
+            <w:pPr>
+              <w:pStyle w:val="Compact"/>
+              <w:jc w:val="left"/>
+            </w:pPr>
+            <w:r>
+              <w:t xml:space="preserve">Assignment 1</w:t>
+            </w:r>
+          </w:p>
+        </w:tc>
+      </w:tr>
+      <w:tr>
+        <w:tc>
+          <w:tcPr/>
+          <w:p>
+            <w:pPr>
+              <w:pStyle w:val="Compact"/>
+              <w:jc w:val="left"/>
+            </w:pPr>
+            <w:r>
+              <w:t xml:space="preserve">11</w:t>
+            </w:r>
+          </w:p>
+        </w:tc>
+        <w:tc>
+          <w:tcPr/>
+          <w:p>
+            <w:pPr>
+              <w:pStyle w:val="Compact"/>
+              <w:jc w:val="left"/>
+            </w:pPr>
+            <w:r>
+              <w:t xml:space="preserve">Nov 4</w:t>
+            </w:r>
+          </w:p>
+        </w:tc>
+        <w:tc>
+          <w:tcPr/>
+          <w:p>
+            <w:pPr>
+              <w:pStyle w:val="Compact"/>
+              <w:jc w:val="left"/>
+            </w:pPr>
+            <w:r>
+              <w:t xml:space="preserve">Selection Models (Individual-Level Data): Tobit Type I–V; censored data, Heckman selection. Unobserved Heterogeneity: latent class; random coefficients</w:t>
+            </w:r>
+          </w:p>
+        </w:tc>
+        <w:tc>
+          <w:tcPr/>
+          <w:p>
+            <w:pPr>
+              <w:pStyle w:val="Compact"/>
+            </w:pPr>
+          </w:p>
+        </w:tc>
+      </w:tr>
+      <w:tr>
+        <w:tc>
+          <w:tcPr/>
+          <w:p>
+            <w:pPr>
+              <w:pStyle w:val="Compact"/>
+              <w:jc w:val="left"/>
+            </w:pPr>
+            <w:r>
+              <w:t xml:space="preserve">12</w:t>
+            </w:r>
+          </w:p>
+        </w:tc>
+        <w:tc>
+          <w:tcPr/>
+          <w:p>
+            <w:pPr>
+              <w:pStyle w:val="Compact"/>
+              <w:jc w:val="left"/>
+            </w:pPr>
+            <w:r>
+              <w:t xml:space="preserve">Nov 11</w:t>
+            </w:r>
+          </w:p>
+        </w:tc>
+        <w:tc>
+          <w:tcPr/>
+          <w:p>
+            <w:pPr>
+              <w:pStyle w:val="Compact"/>
+              <w:jc w:val="left"/>
+            </w:pPr>
+            <w:r>
+              <w:t xml:space="preserve">Veterans Day Holiday (No Class)</w:t>
+            </w:r>
+          </w:p>
+        </w:tc>
+        <w:tc>
+          <w:tcPr/>
+          <w:p>
+            <w:pPr>
+              <w:pStyle w:val="Compact"/>
+            </w:pPr>
+          </w:p>
+        </w:tc>
+      </w:tr>
+      <w:tr>
+        <w:tc>
+          <w:tcPr/>
+          <w:p>
+            <w:pPr>
+              <w:pStyle w:val="Compact"/>
+              <w:jc w:val="left"/>
+            </w:pPr>
+            <w:r>
+              <w:t xml:space="preserve">13</w:t>
+            </w:r>
+          </w:p>
+        </w:tc>
+        <w:tc>
+          <w:tcPr/>
+          <w:p>
+            <w:pPr>
+              <w:pStyle w:val="Compact"/>
+              <w:jc w:val="left"/>
+            </w:pPr>
+            <w:r>
+              <w:t xml:space="preserve">Nov 18</w:t>
+            </w:r>
+          </w:p>
+        </w:tc>
+        <w:tc>
+          <w:tcPr/>
+          <w:p>
+            <w:pPr>
+              <w:pStyle w:val="Compact"/>
+              <w:jc w:val="left"/>
+            </w:pPr>
+            <w:r>
+              <w:t xml:space="preserve">Demand for Differentiated Products (Aggregate Data): BLP fundamentals; BLP extension: long-tail market</w:t>
+            </w:r>
+          </w:p>
+        </w:tc>
+        <w:tc>
+          <w:tcPr/>
+          <w:p>
+            <w:pPr>
+              <w:pStyle w:val="Compact"/>
+              <w:jc w:val="left"/>
+            </w:pPr>
+            <w:r>
+              <w:t xml:space="preserve">Assignment 2</w:t>
+            </w:r>
+          </w:p>
+        </w:tc>
+      </w:tr>
+      <w:tr>
+        <w:tc>
+          <w:tcPr/>
+          <w:p>
+            <w:pPr>
+              <w:pStyle w:val="Compact"/>
+              <w:jc w:val="left"/>
+            </w:pPr>
+            <w:r>
+              <w:t xml:space="preserve">14</w:t>
+            </w:r>
+          </w:p>
+        </w:tc>
+        <w:tc>
+          <w:tcPr/>
+          <w:p>
+            <w:pPr>
+              <w:pStyle w:val="Compact"/>
+              <w:jc w:val="left"/>
+            </w:pPr>
+            <w:r>
+              <w:t xml:space="preserve">Nov 25</w:t>
+            </w:r>
+          </w:p>
+        </w:tc>
+        <w:tc>
+          <w:tcPr/>
+          <w:p>
+            <w:pPr>
+              <w:pStyle w:val="Compact"/>
+              <w:jc w:val="left"/>
+            </w:pPr>
+            <w:r>
+              <w:t xml:space="preserve">Thanksgiving Holiday (No Class)</w:t>
+            </w:r>
+          </w:p>
+        </w:tc>
+        <w:tc>
+          <w:tcPr/>
+          <w:p>
+            <w:pPr>
+              <w:pStyle w:val="Compact"/>
+            </w:pPr>
+          </w:p>
+        </w:tc>
+      </w:tr>
+      <w:tr>
+        <w:tc>
+          <w:tcPr/>
+          <w:p>
+            <w:pPr>
+              <w:pStyle w:val="Compact"/>
+              <w:jc w:val="left"/>
+            </w:pPr>
+            <w:r>
+              <w:t xml:space="preserve">15</w:t>
+            </w:r>
+          </w:p>
+        </w:tc>
+        <w:tc>
+          <w:tcPr/>
+          <w:p>
+            <w:pPr>
+              <w:pStyle w:val="Compact"/>
+              <w:jc w:val="left"/>
+            </w:pPr>
+            <w:r>
+              <w:t xml:space="preserve">Dec 2</w:t>
+            </w:r>
+          </w:p>
+        </w:tc>
+        <w:tc>
+          <w:tcPr/>
+          <w:p>
+            <w:pPr>
+              <w:pStyle w:val="Compact"/>
+              <w:jc w:val="left"/>
+            </w:pPr>
+            <w:r>
+              <w:t xml:space="preserve">Consumer Search Models: simultaneous and sequential search; identification with/without observed search</w:t>
+            </w:r>
+          </w:p>
+        </w:tc>
+        <w:tc>
+          <w:tcPr/>
+          <w:p>
+            <w:pPr>
+              <w:pStyle w:val="Compact"/>
+              <w:jc w:val="left"/>
+            </w:pPr>
+            <w:r>
+              <w:t xml:space="preserve">Assignment 3</w:t>
+            </w:r>
+          </w:p>
+        </w:tc>
+      </w:tr>
+    </w:tbl>
+    <w:p>
+      <w:pPr>
+        <w:pStyle w:val="BodyText"/>
+      </w:pPr>
+      <w:r>
+        <w:rPr>
+          <w:iCs/>
+          <w:i/>
+        </w:rPr>
+        <w:t xml:space="preserve">Note: In the second half, each student will have a turn presenting at least one of the papers assigned.</w:t>
       </w:r>
     </w:p>
     <w:p>
@@ -4906,13 +4053,1314 @@
         </w:pict>
       </w:r>
     </w:p>
+    <w:bookmarkEnd w:id="35"/>
+    <w:bookmarkStart w:id="42" w:name="seminar-readings-second-half"/>
+    <w:p>
+      <w:pPr>
+        <w:pStyle w:val="Heading2"/>
+      </w:pPr>
+      <w:r>
+        <w:t xml:space="preserve">Seminar Readings (Second Half)</w:t>
+      </w:r>
+    </w:p>
+    <w:bookmarkStart w:id="36" w:name="X0ab25fbdb7500518a231435b617825f0b80ad47"/>
+    <w:p>
+      <w:pPr>
+        <w:pStyle w:val="Heading3"/>
+      </w:pPr>
+      <w:r>
+        <w:t xml:space="preserve">Week 8: Basics of Structural and Non-Structural Analysis</w:t>
+      </w:r>
+    </w:p>
+    <w:p>
+      <w:pPr>
+        <w:pStyle w:val="FirstParagraph"/>
+      </w:pPr>
+      <w:r>
+        <w:rPr>
+          <w:bCs/>
+          <w:b/>
+        </w:rPr>
+        <w:t xml:space="preserve">Required:</w:t>
+      </w:r>
+      <w:r>
+        <w:t xml:space="preserve"> </w:t>
+      </w:r>
+      <w:r>
+        <w:t xml:space="preserve">Reiss, P. C. (2011). Structural workshop paper—descriptive, structural, and experimental empirical methods in marketing research.</w:t>
+      </w:r>
+      <w:r>
+        <w:t xml:space="preserve"> </w:t>
+      </w:r>
+      <w:r>
+        <w:rPr>
+          <w:iCs/>
+          <w:i/>
+        </w:rPr>
+        <w:t xml:space="preserve">Marketing Science</w:t>
+      </w:r>
+      <w:r>
+        <w:t xml:space="preserve">, 30(6), 950–964.</w:t>
+      </w:r>
+    </w:p>
+    <w:p>
+      <w:pPr>
+        <w:pStyle w:val="BodyText"/>
+      </w:pPr>
+      <w:r>
+        <w:rPr>
+          <w:bCs/>
+          <w:b/>
+        </w:rPr>
+        <w:t xml:space="preserve">Required:</w:t>
+      </w:r>
+      <w:r>
+        <w:t xml:space="preserve"> </w:t>
+      </w:r>
+      <w:r>
+        <w:t xml:space="preserve">Rust, J. (2014). The limits of inference with theory: A review of Wolpin (2013).</w:t>
+      </w:r>
+      <w:r>
+        <w:t xml:space="preserve"> </w:t>
+      </w:r>
+      <w:r>
+        <w:rPr>
+          <w:iCs/>
+          <w:i/>
+        </w:rPr>
+        <w:t xml:space="preserve">Journal of Economic Literature</w:t>
+      </w:r>
+      <w:r>
+        <w:t xml:space="preserve">, 52(3), 820–850.</w:t>
+      </w:r>
+    </w:p>
+    <w:p>
+      <w:pPr>
+        <w:pStyle w:val="BodyText"/>
+      </w:pPr>
+      <w:r>
+        <w:t xml:space="preserve">Chintagunta, P., Erdem, T., Rossi, P. E., &amp; Wedel, M. (2006). Structural modeling in marketing: review and assessment.</w:t>
+      </w:r>
+      <w:r>
+        <w:t xml:space="preserve"> </w:t>
+      </w:r>
+      <w:r>
+        <w:rPr>
+          <w:iCs/>
+          <w:i/>
+        </w:rPr>
+        <w:t xml:space="preserve">Marketing Science</w:t>
+      </w:r>
+      <w:r>
+        <w:t xml:space="preserve">, 25(6), 604–616.</w:t>
+      </w:r>
+    </w:p>
+    <w:p>
+      <w:pPr>
+        <w:pStyle w:val="BodyText"/>
+      </w:pPr>
+      <w:r>
+        <w:t xml:space="preserve">Keane, M. P. (2010). Structural vs. atheoretic approaches to econometrics.</w:t>
+      </w:r>
+      <w:r>
+        <w:t xml:space="preserve"> </w:t>
+      </w:r>
+      <w:r>
+        <w:rPr>
+          <w:iCs/>
+          <w:i/>
+        </w:rPr>
+        <w:t xml:space="preserve">Journal of Econometrics</w:t>
+      </w:r>
+      <w:r>
+        <w:t xml:space="preserve">, 156(1), 3–20.</w:t>
+      </w:r>
+    </w:p>
+    <w:bookmarkEnd w:id="36"/>
+    <w:bookmarkStart w:id="37" w:name="Xce775c21b7168b611d9ace40905d91c869e0f86"/>
+    <w:p>
+      <w:pPr>
+        <w:pStyle w:val="Heading3"/>
+      </w:pPr>
+      <w:r>
+        <w:t xml:space="preserve">Week 9: Basics of Model Identification and Estimation</w:t>
+      </w:r>
+    </w:p>
+    <w:p>
+      <w:pPr>
+        <w:pStyle w:val="FirstParagraph"/>
+      </w:pPr>
+      <w:r>
+        <w:rPr>
+          <w:bCs/>
+          <w:b/>
+        </w:rPr>
+        <w:t xml:space="preserve">Required:</w:t>
+      </w:r>
+      <w:r>
+        <w:t xml:space="preserve"> </w:t>
+      </w:r>
+      <w:r>
+        <w:t xml:space="preserve">Andrews, I., Gentzkow, M., &amp; Shapiro, J. M. (2017). Measuring the sensitivity of parameter estimates to estimation moments.</w:t>
+      </w:r>
+      <w:r>
+        <w:t xml:space="preserve"> </w:t>
+      </w:r>
+      <w:r>
+        <w:rPr>
+          <w:iCs/>
+          <w:i/>
+        </w:rPr>
+        <w:t xml:space="preserve">The Quarterly Journal of Economics</w:t>
+      </w:r>
+      <w:r>
+        <w:t xml:space="preserve">, 132(4), 1553–1592.</w:t>
+      </w:r>
+    </w:p>
+    <w:p>
+      <w:pPr>
+        <w:pStyle w:val="BodyText"/>
+      </w:pPr>
+      <w:r>
+        <w:rPr>
+          <w:bCs/>
+          <w:b/>
+        </w:rPr>
+        <w:t xml:space="preserve">Required:</w:t>
+      </w:r>
+      <w:r>
+        <w:t xml:space="preserve"> </w:t>
+      </w:r>
+      <w:r>
+        <w:t xml:space="preserve">Wei, Y., &amp; Jiang, Z. (2025). Estimating parameters of structural models using neural networks.</w:t>
+      </w:r>
+      <w:r>
+        <w:t xml:space="preserve"> </w:t>
+      </w:r>
+      <w:r>
+        <w:rPr>
+          <w:iCs/>
+          <w:i/>
+        </w:rPr>
+        <w:t xml:space="preserve">Marketing Science</w:t>
+      </w:r>
+      <w:r>
+        <w:t xml:space="preserve">, 44(1), 102–128.</w:t>
+      </w:r>
+    </w:p>
+    <w:p>
+      <w:pPr>
+        <w:pStyle w:val="BodyText"/>
+      </w:pPr>
+      <w:r>
+        <w:t xml:space="preserve">Rothenberg, T. J. (1971). Identification in parametric models.</w:t>
+      </w:r>
+      <w:r>
+        <w:t xml:space="preserve"> </w:t>
+      </w:r>
+      <w:r>
+        <w:rPr>
+          <w:iCs/>
+          <w:i/>
+        </w:rPr>
+        <w:t xml:space="preserve">Econometrica</w:t>
+      </w:r>
+      <w:r>
+        <w:t xml:space="preserve">, 577–591.</w:t>
+      </w:r>
+    </w:p>
+    <w:p>
+      <w:pPr>
+        <w:pStyle w:val="BodyText"/>
+      </w:pPr>
+      <w:r>
+        <w:t xml:space="preserve">Lewbel, A. (2019). The identification zoo: Meanings of identification in econometrics.</w:t>
+      </w:r>
+      <w:r>
+        <w:t xml:space="preserve"> </w:t>
+      </w:r>
+      <w:r>
+        <w:rPr>
+          <w:iCs/>
+          <w:i/>
+        </w:rPr>
+        <w:t xml:space="preserve">Journal of Economic Literature</w:t>
+      </w:r>
+      <w:r>
+        <w:t xml:space="preserve">, 57(4), 835–903.</w:t>
+      </w:r>
+    </w:p>
+    <w:p>
+      <w:pPr>
+        <w:pStyle w:val="BodyText"/>
+      </w:pPr>
+      <w:r>
+        <w:t xml:space="preserve">Andrews, I., Gentzkow, M., &amp; Shapiro, J. M. (2020). On the informativeness of descriptive statistics for structural estimates.</w:t>
+      </w:r>
+      <w:r>
+        <w:t xml:space="preserve"> </w:t>
+      </w:r>
+      <w:r>
+        <w:rPr>
+          <w:iCs/>
+          <w:i/>
+        </w:rPr>
+        <w:t xml:space="preserve">Econometrica</w:t>
+      </w:r>
+      <w:r>
+        <w:t xml:space="preserve">, 88(6), 2231–2258.</w:t>
+      </w:r>
+    </w:p>
+    <w:bookmarkEnd w:id="37"/>
+    <w:bookmarkStart w:id="38" w:name="X8e014cc24d5306a9808b751ed997bd86e3b9da2"/>
+    <w:p>
+      <w:pPr>
+        <w:pStyle w:val="Heading3"/>
+      </w:pPr>
+      <w:r>
+        <w:t xml:space="preserve">Week 10: Discrete Choice Models (Individual-Level Data)</w:t>
+      </w:r>
+    </w:p>
+    <w:p>
+      <w:pPr>
+        <w:pStyle w:val="FirstParagraph"/>
+      </w:pPr>
+      <w:r>
+        <w:rPr>
+          <w:bCs/>
+          <w:b/>
+        </w:rPr>
+        <w:t xml:space="preserve">Required:</w:t>
+      </w:r>
+      <w:r>
+        <w:t xml:space="preserve"> </w:t>
+      </w:r>
+      <w:r>
+        <w:t xml:space="preserve">Guadagni, P. M., &amp; Little, J. D. (1983). A logit model of brand choice calibrated on scanner data.</w:t>
+      </w:r>
+      <w:r>
+        <w:t xml:space="preserve"> </w:t>
+      </w:r>
+      <w:r>
+        <w:rPr>
+          <w:iCs/>
+          <w:i/>
+        </w:rPr>
+        <w:t xml:space="preserve">Marketing Science</w:t>
+      </w:r>
+      <w:r>
+        <w:t xml:space="preserve">, 2(3), 203–238.</w:t>
+      </w:r>
+    </w:p>
+    <w:p>
+      <w:pPr>
+        <w:pStyle w:val="BodyText"/>
+      </w:pPr>
+      <w:r>
+        <w:rPr>
+          <w:bCs/>
+          <w:b/>
+        </w:rPr>
+        <w:t xml:space="preserve">Required:</w:t>
+      </w:r>
+      <w:r>
+        <w:t xml:space="preserve"> </w:t>
+      </w:r>
+      <w:r>
+        <w:t xml:space="preserve">Fader, P. S., &amp; Hardie, B. G. (1996). Modeling consumer choice among SKUs.</w:t>
+      </w:r>
+      <w:r>
+        <w:t xml:space="preserve"> </w:t>
+      </w:r>
+      <w:r>
+        <w:rPr>
+          <w:iCs/>
+          <w:i/>
+        </w:rPr>
+        <w:t xml:space="preserve">Journal of Marketing Research</w:t>
+      </w:r>
+      <w:r>
+        <w:t xml:space="preserve">, 33(4), 442–452.</w:t>
+      </w:r>
+    </w:p>
+    <w:p>
+      <w:pPr>
+        <w:pStyle w:val="BodyText"/>
+      </w:pPr>
+      <w:r>
+        <w:rPr>
+          <w:bCs/>
+          <w:b/>
+        </w:rPr>
+        <w:t xml:space="preserve">Required:</w:t>
+      </w:r>
+      <w:r>
+        <w:t xml:space="preserve"> </w:t>
+      </w:r>
+      <w:r>
+        <w:t xml:space="preserve">Sifringer, B., Lurkin, V., &amp; Alahi, A. (2020). Enhancing discrete choice models with representation learning.</w:t>
+      </w:r>
+      <w:r>
+        <w:t xml:space="preserve"> </w:t>
+      </w:r>
+      <w:r>
+        <w:rPr>
+          <w:iCs/>
+          <w:i/>
+        </w:rPr>
+        <w:t xml:space="preserve">Transportation Research Part B: Methodological</w:t>
+      </w:r>
+      <w:r>
+        <w:t xml:space="preserve">, 140, 236–261.</w:t>
+      </w:r>
+    </w:p>
+    <w:bookmarkEnd w:id="38"/>
+    <w:bookmarkStart w:id="39" w:name="X4c27de148a57c14bb78ed9f7beafbed05be6e57"/>
+    <w:p>
+      <w:pPr>
+        <w:pStyle w:val="Heading3"/>
+      </w:pPr>
+      <w:r>
+        <w:t xml:space="preserve">Week 11: Selection Models and Unobserved Heterogeneity (Individual-Level Data)</w:t>
+      </w:r>
+    </w:p>
+    <w:p>
+      <w:pPr>
+        <w:pStyle w:val="FirstParagraph"/>
+      </w:pPr>
+      <w:r>
+        <w:rPr>
+          <w:bCs/>
+          <w:b/>
+        </w:rPr>
+        <w:t xml:space="preserve">Required:</w:t>
+      </w:r>
+      <w:r>
+        <w:t xml:space="preserve"> </w:t>
+      </w:r>
+      <w:r>
+        <w:t xml:space="preserve">Gronau, R. (1973). The effect of children on the housewife’s value of time.</w:t>
+      </w:r>
+      <w:r>
+        <w:t xml:space="preserve"> </w:t>
+      </w:r>
+      <w:r>
+        <w:rPr>
+          <w:iCs/>
+          <w:i/>
+        </w:rPr>
+        <w:t xml:space="preserve">Journal of Political Economy</w:t>
+      </w:r>
+      <w:r>
+        <w:t xml:space="preserve">, 81(2, Part 2), S168–S199.</w:t>
+      </w:r>
+    </w:p>
+    <w:p>
+      <w:pPr>
+        <w:pStyle w:val="BodyText"/>
+      </w:pPr>
+      <w:r>
+        <w:rPr>
+          <w:bCs/>
+          <w:b/>
+        </w:rPr>
+        <w:t xml:space="preserve">Required:</w:t>
+      </w:r>
+      <w:r>
+        <w:t xml:space="preserve"> </w:t>
+      </w:r>
+      <w:r>
+        <w:t xml:space="preserve">Kamakura, W. A., &amp; Russell, G. J. (1989). A probabilistic choice model for market segmentation and elasticity structure.</w:t>
+      </w:r>
+      <w:r>
+        <w:t xml:space="preserve"> </w:t>
+      </w:r>
+      <w:r>
+        <w:rPr>
+          <w:iCs/>
+          <w:i/>
+        </w:rPr>
+        <w:t xml:space="preserve">Journal of Marketing Research</w:t>
+      </w:r>
+      <w:r>
+        <w:t xml:space="preserve">, 26(4), 379–390.</w:t>
+      </w:r>
+    </w:p>
+    <w:p>
+      <w:pPr>
+        <w:pStyle w:val="BodyText"/>
+      </w:pPr>
+      <w:r>
+        <w:t xml:space="preserve">Heckman, J. J. (1979). Sample selection bias as a specification error.</w:t>
+      </w:r>
+      <w:r>
+        <w:t xml:space="preserve"> </w:t>
+      </w:r>
+      <w:r>
+        <w:rPr>
+          <w:iCs/>
+          <w:i/>
+        </w:rPr>
+        <w:t xml:space="preserve">Econometrica</w:t>
+      </w:r>
+      <w:r>
+        <w:t xml:space="preserve">, 153–161.</w:t>
+      </w:r>
+    </w:p>
+    <w:p>
+      <w:pPr>
+        <w:pStyle w:val="BodyText"/>
+      </w:pPr>
+      <w:r>
+        <w:t xml:space="preserve">Amemiya, T. (1984). Tobit models: A survey.</w:t>
+      </w:r>
+      <w:r>
+        <w:t xml:space="preserve"> </w:t>
+      </w:r>
+      <w:r>
+        <w:rPr>
+          <w:iCs/>
+          <w:i/>
+        </w:rPr>
+        <w:t xml:space="preserve">Journal of Econometrics</w:t>
+      </w:r>
+      <w:r>
+        <w:t xml:space="preserve">, 24(1-2), 3–61.</w:t>
+      </w:r>
+    </w:p>
+    <w:bookmarkEnd w:id="39"/>
+    <w:bookmarkStart w:id="40" w:name="X56b81ba9909107ead1ec9219e3b957fc20f9788"/>
+    <w:p>
+      <w:pPr>
+        <w:pStyle w:val="Heading3"/>
+      </w:pPr>
+      <w:r>
+        <w:t xml:space="preserve">Week 13: Demand for Differentiated Products (Aggregate Data)</w:t>
+      </w:r>
+    </w:p>
+    <w:p>
+      <w:pPr>
+        <w:pStyle w:val="FirstParagraph"/>
+      </w:pPr>
+      <w:r>
+        <w:rPr>
+          <w:bCs/>
+          <w:b/>
+        </w:rPr>
+        <w:t xml:space="preserve">Required:</w:t>
+      </w:r>
+      <w:r>
+        <w:t xml:space="preserve"> </w:t>
+      </w:r>
+      <w:r>
+        <w:t xml:space="preserve">Berry, S. T. (1994). Estimating discrete-choice models of product differentiation.</w:t>
+      </w:r>
+      <w:r>
+        <w:t xml:space="preserve"> </w:t>
+      </w:r>
+      <w:r>
+        <w:rPr>
+          <w:iCs/>
+          <w:i/>
+        </w:rPr>
+        <w:t xml:space="preserve">The RAND Journal of Economics</w:t>
+      </w:r>
+      <w:r>
+        <w:t xml:space="preserve">, 242–262.</w:t>
+      </w:r>
+    </w:p>
+    <w:p>
+      <w:pPr>
+        <w:pStyle w:val="BodyText"/>
+      </w:pPr>
+      <w:r>
+        <w:rPr>
+          <w:bCs/>
+          <w:b/>
+        </w:rPr>
+        <w:t xml:space="preserve">Required:</w:t>
+      </w:r>
+      <w:r>
+        <w:t xml:space="preserve"> </w:t>
+      </w:r>
+      <w:r>
+        <w:t xml:space="preserve">Berry, S., Levinsohn, J., &amp; Pakes, A. (1995). Automobile prices in market equilibrium.</w:t>
+      </w:r>
+      <w:r>
+        <w:t xml:space="preserve"> </w:t>
+      </w:r>
+      <w:r>
+        <w:rPr>
+          <w:iCs/>
+          <w:i/>
+        </w:rPr>
+        <w:t xml:space="preserve">Econometrica</w:t>
+      </w:r>
+      <w:r>
+        <w:t xml:space="preserve">, 63(4), 841–890.</w:t>
+      </w:r>
+    </w:p>
+    <w:p>
+      <w:pPr>
+        <w:pStyle w:val="BodyText"/>
+      </w:pPr>
+      <w:r>
+        <w:rPr>
+          <w:bCs/>
+          <w:b/>
+        </w:rPr>
+        <w:t xml:space="preserve">Required:</w:t>
+      </w:r>
+      <w:r>
+        <w:t xml:space="preserve"> </w:t>
+      </w:r>
+      <w:r>
+        <w:t xml:space="preserve">Nevo, A. (2001). Measuring market power in the ready-to-eat cereal industry.</w:t>
+      </w:r>
+      <w:r>
+        <w:t xml:space="preserve"> </w:t>
+      </w:r>
+      <w:r>
+        <w:rPr>
+          <w:iCs/>
+          <w:i/>
+        </w:rPr>
+        <w:t xml:space="preserve">Econometrica</w:t>
+      </w:r>
+      <w:r>
+        <w:t xml:space="preserve">, 69(2), 307–342.</w:t>
+      </w:r>
+    </w:p>
+    <w:p>
+      <w:pPr>
+        <w:pStyle w:val="BodyText"/>
+      </w:pPr>
+      <w:r>
+        <w:rPr>
+          <w:bCs/>
+          <w:b/>
+        </w:rPr>
+        <w:t xml:space="preserve">Required:</w:t>
+      </w:r>
+      <w:r>
+        <w:t xml:space="preserve"> </w:t>
+      </w:r>
+      <w:r>
+        <w:t xml:space="preserve">Adam, H., He, P., &amp; Zheng, F. (2024). Machine learning for demand estimation in long tail markets.</w:t>
+      </w:r>
+      <w:r>
+        <w:t xml:space="preserve"> </w:t>
+      </w:r>
+      <w:r>
+        <w:rPr>
+          <w:iCs/>
+          <w:i/>
+        </w:rPr>
+        <w:t xml:space="preserve">Management Science</w:t>
+      </w:r>
+      <w:r>
+        <w:t xml:space="preserve">, 70(8), 5040–5065.</w:t>
+      </w:r>
+    </w:p>
+    <w:p>
+      <w:pPr>
+        <w:pStyle w:val="BodyText"/>
+      </w:pPr>
+      <w:r>
+        <w:t xml:space="preserve">Nevo, A. (2000). A practitioner’s guide to estimation of random-coefficients logit models of demand.</w:t>
+      </w:r>
+      <w:r>
+        <w:t xml:space="preserve"> </w:t>
+      </w:r>
+      <w:r>
+        <w:rPr>
+          <w:iCs/>
+          <w:i/>
+        </w:rPr>
+        <w:t xml:space="preserve">Journal of Economics &amp; Management Strategy</w:t>
+      </w:r>
+      <w:r>
+        <w:t xml:space="preserve">, 9(4), 513–548.</w:t>
+      </w:r>
+    </w:p>
+    <w:p>
+      <w:pPr>
+        <w:pStyle w:val="BodyText"/>
+      </w:pPr>
+      <w:r>
+        <w:t xml:space="preserve">Gandhi, A., Lu, Z., &amp; Shi, X. (2023). Estimating demand for differentiated products with zeroes in market share data.</w:t>
+      </w:r>
+      <w:r>
+        <w:t xml:space="preserve"> </w:t>
+      </w:r>
+      <w:r>
+        <w:rPr>
+          <w:iCs/>
+          <w:i/>
+        </w:rPr>
+        <w:t xml:space="preserve">Quantitative Economics</w:t>
+      </w:r>
+      <w:r>
+        <w:t xml:space="preserve">, 14(2), 381–418.</w:t>
+      </w:r>
+    </w:p>
+    <w:bookmarkEnd w:id="40"/>
+    <w:bookmarkStart w:id="41" w:name="week-15-consumer-search-models"/>
+    <w:p>
+      <w:pPr>
+        <w:pStyle w:val="Heading3"/>
+      </w:pPr>
+      <w:r>
+        <w:t xml:space="preserve">Week 15: Consumer Search Models</w:t>
+      </w:r>
+    </w:p>
+    <w:p>
+      <w:pPr>
+        <w:pStyle w:val="FirstParagraph"/>
+      </w:pPr>
+      <w:r>
+        <w:rPr>
+          <w:bCs/>
+          <w:b/>
+        </w:rPr>
+        <w:t xml:space="preserve">Required:</w:t>
+      </w:r>
+      <w:r>
+        <w:t xml:space="preserve"> </w:t>
+      </w:r>
+      <w:r>
+        <w:t xml:space="preserve">Mehta, N., Rajiv, S., &amp; Srinivasan, K. (2003). Price uncertainty and consumer search: A structural model of consideration set formation.</w:t>
+      </w:r>
+      <w:r>
+        <w:t xml:space="preserve"> </w:t>
+      </w:r>
+      <w:r>
+        <w:rPr>
+          <w:iCs/>
+          <w:i/>
+        </w:rPr>
+        <w:t xml:space="preserve">Marketing Science</w:t>
+      </w:r>
+      <w:r>
+        <w:t xml:space="preserve">, 22(1), 58–84.</w:t>
+      </w:r>
+    </w:p>
+    <w:p>
+      <w:pPr>
+        <w:pStyle w:val="BodyText"/>
+      </w:pPr>
+      <w:r>
+        <w:rPr>
+          <w:bCs/>
+          <w:b/>
+        </w:rPr>
+        <w:t xml:space="preserve">Required:</w:t>
+      </w:r>
+      <w:r>
+        <w:t xml:space="preserve"> </w:t>
+      </w:r>
+      <w:r>
+        <w:t xml:space="preserve">Ursu, R. M. (2018). The power of rankings: Quantifying the effect of rankings on online consumer search and purchase decisions.</w:t>
+      </w:r>
+      <w:r>
+        <w:t xml:space="preserve"> </w:t>
+      </w:r>
+      <w:r>
+        <w:rPr>
+          <w:iCs/>
+          <w:i/>
+        </w:rPr>
+        <w:t xml:space="preserve">Marketing Science</w:t>
+      </w:r>
+      <w:r>
+        <w:t xml:space="preserve">, 37(4), 530–552.</w:t>
+      </w:r>
+    </w:p>
+    <w:p>
+      <w:pPr>
+        <w:pStyle w:val="BodyText"/>
+      </w:pPr>
+      <w:r>
+        <w:rPr>
+          <w:bCs/>
+          <w:b/>
+        </w:rPr>
+        <w:t xml:space="preserve">Required:</w:t>
+      </w:r>
+      <w:r>
+        <w:t xml:space="preserve"> </w:t>
+      </w:r>
+      <w:r>
+        <w:t xml:space="preserve">Honka, E., &amp; Chintagunta, P. (2017). Simultaneous or sequential? Search strategies in the US auto insurance industry.</w:t>
+      </w:r>
+      <w:r>
+        <w:t xml:space="preserve"> </w:t>
+      </w:r>
+      <w:r>
+        <w:rPr>
+          <w:iCs/>
+          <w:i/>
+        </w:rPr>
+        <w:t xml:space="preserve">Marketing Science</w:t>
+      </w:r>
+      <w:r>
+        <w:t xml:space="preserve">, 36(1), 21–42.</w:t>
+      </w:r>
+    </w:p>
+    <w:p>
+      <w:pPr>
+        <w:pStyle w:val="BodyText"/>
+      </w:pPr>
+      <w:r>
+        <w:t xml:space="preserve">Hong, H., &amp; Shum, M. (2006). Using price distributions to estimate search costs.</w:t>
+      </w:r>
+      <w:r>
+        <w:t xml:space="preserve"> </w:t>
+      </w:r>
+      <w:r>
+        <w:rPr>
+          <w:iCs/>
+          <w:i/>
+        </w:rPr>
+        <w:t xml:space="preserve">The RAND Journal of Economics</w:t>
+      </w:r>
+      <w:r>
+        <w:t xml:space="preserve">, 37(2), 257–275.</w:t>
+      </w:r>
+    </w:p>
+    <w:p>
+      <w:pPr>
+        <w:pStyle w:val="BodyText"/>
+      </w:pPr>
+      <w:r>
+        <w:t xml:space="preserve">Honka, E. (2014). Quantifying search and switching costs in the US auto insurance industry.</w:t>
+      </w:r>
+      <w:r>
+        <w:t xml:space="preserve"> </w:t>
+      </w:r>
+      <w:r>
+        <w:rPr>
+          <w:iCs/>
+          <w:i/>
+        </w:rPr>
+        <w:t xml:space="preserve">The RAND Journal of Economics</w:t>
+      </w:r>
+      <w:r>
+        <w:t xml:space="preserve">, 45(4), 847–884.</w:t>
+      </w:r>
+    </w:p>
+    <w:p>
+      <w:pPr>
+        <w:pStyle w:val="BodyText"/>
+      </w:pPr>
+      <w:r>
+        <w:t xml:space="preserve">Santos, B. D. L., Hortaçsu, A., &amp; Wildenbeest, M. R. (2012). Testing models of consumer search using data on web browsing and purchasing behavior.</w:t>
+      </w:r>
+      <w:r>
+        <w:t xml:space="preserve"> </w:t>
+      </w:r>
+      <w:r>
+        <w:rPr>
+          <w:iCs/>
+          <w:i/>
+        </w:rPr>
+        <w:t xml:space="preserve">American Economic Review</w:t>
+      </w:r>
+      <w:r>
+        <w:t xml:space="preserve">, 102(6), 2955–2980.</w:t>
+      </w:r>
+    </w:p>
+    <w:p>
+      <w:r>
+        <w:pict>
+          <v:rect style="width:0;height:1.5pt" o:hralign="center" o:hrstd="t" o:hr="t"/>
+        </w:pict>
+      </w:r>
+    </w:p>
+    <w:bookmarkEnd w:id="41"/>
     <w:bookmarkEnd w:id="42"/>
-    <w:bookmarkStart w:id="43" w:name="course-notes-and-attendance"/>
+    <w:bookmarkStart w:id="43" w:name="Xcd16896efe5c0e37c48dbdf87d0e75ae69c53b6"/>
     <w:p>
       <w:pPr>
         <w:pStyle w:val="Heading2"/>
       </w:pPr>
       <w:r>
+        <w:t xml:space="preserve">Software Requirements and Online References</w:t>
+      </w:r>
+    </w:p>
+    <w:p>
+      <w:pPr>
+        <w:pStyle w:val="FirstParagraph"/>
+      </w:pPr>
+      <w:r>
+        <w:t xml:space="preserve">Each of these books/courses is freely available online:</w:t>
+      </w:r>
+    </w:p>
+    <w:p>
+      <w:pPr>
+        <w:numPr>
+          <w:ilvl w:val="0"/>
+          <w:numId w:val="1017"/>
+        </w:numPr>
+        <w:pStyle w:val="Compact"/>
+      </w:pPr>
+      <w:r>
+        <w:t xml:space="preserve">R for Marketing Research and Analytics</w:t>
+      </w:r>
+    </w:p>
+    <w:p>
+      <w:pPr>
+        <w:numPr>
+          <w:ilvl w:val="0"/>
+          <w:numId w:val="1017"/>
+        </w:numPr>
+        <w:pStyle w:val="Compact"/>
+      </w:pPr>
+      <w:r>
+        <w:t xml:space="preserve">Grant McDermott’s EC 607 course, to whom I dedicate a special thank you for sharing the course material</w:t>
+      </w:r>
+    </w:p>
+    <w:p>
+      <w:pPr>
+        <w:numPr>
+          <w:ilvl w:val="0"/>
+          <w:numId w:val="1017"/>
+        </w:numPr>
+        <w:pStyle w:val="Compact"/>
+      </w:pPr>
+      <w:r>
+        <w:rPr>
+          <w:iCs/>
+          <w:i/>
+        </w:rPr>
+        <w:t xml:space="preserve">Data Visualization: A Practical Introduction</w:t>
+      </w:r>
+      <w:r>
+        <w:t xml:space="preserve">, Kieran Healy</w:t>
+      </w:r>
+    </w:p>
+    <w:p>
+      <w:pPr>
+        <w:numPr>
+          <w:ilvl w:val="0"/>
+          <w:numId w:val="1017"/>
+        </w:numPr>
+        <w:pStyle w:val="Compact"/>
+      </w:pPr>
+      <w:r>
+        <w:rPr>
+          <w:iCs/>
+          <w:i/>
+        </w:rPr>
+        <w:t xml:space="preserve">R for Data Science</w:t>
+      </w:r>
+      <w:r>
+        <w:t xml:space="preserve">, Garrett Grolemund and Hadley Wickham</w:t>
+      </w:r>
+    </w:p>
+    <w:p>
+      <w:pPr>
+        <w:numPr>
+          <w:ilvl w:val="0"/>
+          <w:numId w:val="1017"/>
+        </w:numPr>
+        <w:pStyle w:val="Compact"/>
+      </w:pPr>
+      <w:r>
+        <w:rPr>
+          <w:iCs/>
+          <w:i/>
+        </w:rPr>
+        <w:t xml:space="preserve">Advanced R</w:t>
+      </w:r>
+      <w:r>
+        <w:t xml:space="preserve">, Hadley Wickham</w:t>
+      </w:r>
+    </w:p>
+    <w:p>
+      <w:pPr>
+        <w:numPr>
+          <w:ilvl w:val="0"/>
+          <w:numId w:val="1017"/>
+        </w:numPr>
+        <w:pStyle w:val="Compact"/>
+      </w:pPr>
+      <w:r>
+        <w:rPr>
+          <w:iCs/>
+          <w:i/>
+        </w:rPr>
+        <w:t xml:space="preserve">R Markdown: The Definitive Guide</w:t>
+      </w:r>
+      <w:r>
+        <w:t xml:space="preserve">, Yihui Xie, JJ Allaire, and Garrett Grolemund</w:t>
+      </w:r>
+    </w:p>
+    <w:p>
+      <w:pPr>
+        <w:numPr>
+          <w:ilvl w:val="0"/>
+          <w:numId w:val="1017"/>
+        </w:numPr>
+        <w:pStyle w:val="Compact"/>
+      </w:pPr>
+      <w:r>
+        <w:t xml:space="preserve">Parallel computing in R</w:t>
+      </w:r>
+    </w:p>
+    <w:p>
+      <w:pPr>
+        <w:numPr>
+          <w:ilvl w:val="0"/>
+          <w:numId w:val="1017"/>
+        </w:numPr>
+        <w:pStyle w:val="Compact"/>
+      </w:pPr>
+      <w:r>
+        <w:t xml:space="preserve">Awesome Reproducible Research (a curated list of reproducible research case studies, projects, tutorials, and media)</w:t>
+      </w:r>
+    </w:p>
+    <w:p>
+      <w:pPr>
+        <w:numPr>
+          <w:ilvl w:val="0"/>
+          <w:numId w:val="1017"/>
+        </w:numPr>
+        <w:pStyle w:val="Compact"/>
+      </w:pPr>
+      <w:r>
+        <w:t xml:space="preserve">https://pytorch.org/tutorials/beginner/deep_learning_60min_blitz.htm</w:t>
+      </w:r>
+    </w:p>
+    <w:p>
+      <w:pPr>
+        <w:numPr>
+          <w:ilvl w:val="0"/>
+          <w:numId w:val="1017"/>
+        </w:numPr>
+        <w:pStyle w:val="Compact"/>
+      </w:pPr>
+      <w:r>
+        <w:t xml:space="preserve">An accessible introduction to PyTorch: https://cs230.stanford.edu/blog/pytorch/#models-in-pytorch</w:t>
+      </w:r>
+    </w:p>
+    <w:p>
+      <w:pPr>
+        <w:pStyle w:val="FirstParagraph"/>
+      </w:pPr>
+      <w:r>
+        <w:rPr>
+          <w:bCs/>
+          <w:b/>
+        </w:rPr>
+        <w:t xml:space="preserve">VS Code</w:t>
+      </w:r>
+      <w:r>
+        <w:t xml:space="preserve"> </w:t>
+      </w:r>
+      <w:r>
+        <w:t xml:space="preserve">(the standard editor for the first half of this course)</w:t>
+      </w:r>
+      <w:r>
+        <w:t xml:space="preserve"> </w:t>
+      </w:r>
+      <w:r>
+        <w:t xml:space="preserve">https://code.visualstudio.com, install the R, Python, Remote-SSH, and Quarto extensions.</w:t>
+      </w:r>
+    </w:p>
+    <w:p>
+      <w:pPr>
+        <w:pStyle w:val="BodyText"/>
+      </w:pPr>
+      <w:r>
+        <w:rPr>
+          <w:bCs/>
+          <w:b/>
+        </w:rPr>
+        <w:t xml:space="preserve">R</w:t>
+      </w:r>
+      <w:r>
+        <w:t xml:space="preserve"> </w:t>
+      </w:r>
+      <w:r>
+        <w:t xml:space="preserve">https://www.r-project.org/</w:t>
+      </w:r>
+    </w:p>
+    <w:p>
+      <w:pPr>
+        <w:pStyle w:val="BodyText"/>
+      </w:pPr>
+      <w:r>
+        <w:rPr>
+          <w:bCs/>
+          <w:b/>
+        </w:rPr>
+        <w:t xml:space="preserve">Python</w:t>
+      </w:r>
+      <w:r>
+        <w:t xml:space="preserve">, installed and managed with</w:t>
+      </w:r>
+      <w:r>
+        <w:t xml:space="preserve"> </w:t>
+      </w:r>
+      <w:r>
+        <w:rPr>
+          <w:rStyle w:val="VerbatimChar"/>
+        </w:rPr>
+        <w:t xml:space="preserve">uv</w:t>
+      </w:r>
+      <w:r>
+        <w:t xml:space="preserve"> </w:t>
+      </w:r>
+      <w:r>
+        <w:t xml:space="preserve">https://docs.astral.sh/uv/ —</w:t>
+      </w:r>
+      <w:r>
+        <w:t xml:space="preserve"> </w:t>
+      </w:r>
+      <w:r>
+        <w:rPr>
+          <w:rStyle w:val="VerbatimChar"/>
+        </w:rPr>
+        <w:t xml:space="preserve">uv</w:t>
+      </w:r>
+      <w:r>
+        <w:t xml:space="preserve"> </w:t>
+      </w:r>
+      <w:r>
+        <w:t xml:space="preserve">installs Python for you and records the exact package versions your project used, so the environment can be rebuilt later. It replaces</w:t>
+      </w:r>
+      <w:r>
+        <w:t xml:space="preserve"> </w:t>
+      </w:r>
+      <w:r>
+        <w:rPr>
+          <w:rStyle w:val="VerbatimChar"/>
+        </w:rPr>
+        <w:t xml:space="preserve">pip</w:t>
+      </w:r>
+      <w:r>
+        <w:t xml:space="preserve">,</w:t>
+      </w:r>
+      <w:r>
+        <w:t xml:space="preserve"> </w:t>
+      </w:r>
+      <w:r>
+        <w:rPr>
+          <w:rStyle w:val="VerbatimChar"/>
+        </w:rPr>
+        <w:t xml:space="preserve">venv</w:t>
+      </w:r>
+      <w:r>
+        <w:t xml:space="preserve">, and</w:t>
+      </w:r>
+      <w:r>
+        <w:t xml:space="preserve"> </w:t>
+      </w:r>
+      <w:r>
+        <w:rPr>
+          <w:rStyle w:val="VerbatimChar"/>
+        </w:rPr>
+        <w:t xml:space="preserve">pyenv</w:t>
+      </w:r>
+      <w:r>
+        <w:t xml:space="preserve">.</w:t>
+      </w:r>
+    </w:p>
+    <w:p>
+      <w:pPr>
+        <w:pStyle w:val="BodyText"/>
+      </w:pPr>
+      <w:r>
+        <w:rPr>
+          <w:bCs/>
+          <w:b/>
+        </w:rPr>
+        <w:t xml:space="preserve">Git and GitHub</w:t>
+      </w:r>
+      <w:r>
+        <w:t xml:space="preserve"> </w:t>
+      </w:r>
+      <w:r>
+        <w:t xml:space="preserve">https://git-scm.com/downloads · https://github.com/</w:t>
+      </w:r>
+    </w:p>
+    <w:p>
+      <w:pPr>
+        <w:pStyle w:val="BodyText"/>
+      </w:pPr>
+      <w:r>
+        <w:rPr>
+          <w:bCs/>
+          <w:b/>
+        </w:rPr>
+        <w:t xml:space="preserve">SQL client</w:t>
+      </w:r>
+      <w:r>
+        <w:t xml:space="preserve"> </w:t>
+      </w:r>
+      <w:r>
+        <w:t xml:space="preserve">(for browsing the course database directly)</w:t>
+      </w:r>
+      <w:r>
+        <w:t xml:space="preserve"> </w:t>
+      </w:r>
+      <w:r>
+        <w:t xml:space="preserve">Mac: https://sequel-ace.com/ · Windows: https://www.mysql.com/products/workbench/</w:t>
+      </w:r>
+    </w:p>
+    <w:p>
+      <w:pPr>
+        <w:pStyle w:val="BodyText"/>
+      </w:pPr>
+      <w:r>
+        <w:rPr>
+          <w:bCs/>
+          <w:b/>
+        </w:rPr>
+        <w:t xml:space="preserve">DuckDB</w:t>
+      </w:r>
+      <w:r>
+        <w:t xml:space="preserve"> </w:t>
+      </w:r>
+      <w:r>
+        <w:t xml:space="preserve">https://duckdb.org/</w:t>
+      </w:r>
+    </w:p>
+    <w:p>
+      <w:pPr>
+        <w:pStyle w:val="BodyText"/>
+      </w:pPr>
+      <w:r>
+        <w:rPr>
+          <w:bCs/>
+          <w:b/>
+        </w:rPr>
+        <w:t xml:space="preserve">Course servers</w:t>
+      </w:r>
+      <w:r>
+        <w:t xml:space="preserve"> </w:t>
+      </w:r>
+      <w:r>
+        <w:t xml:space="preserve">(first half; USC network or VPN required)</w:t>
+      </w:r>
+      <w:r>
+        <w:t xml:space="preserve"> </w:t>
+      </w:r>
+      <w:r>
+        <w:t xml:space="preserve">Two Marshall research machines; addresses distributed in class. Connect with VS Code Remote-SSH.</w:t>
+      </w:r>
+    </w:p>
+    <w:p>
+      <w:pPr>
+        <w:pStyle w:val="BodyText"/>
+      </w:pPr>
+      <w:r>
+        <w:rPr>
+          <w:bCs/>
+          <w:b/>
+        </w:rPr>
+        <w:t xml:space="preserve">AI tools</w:t>
+      </w:r>
+      <w:r>
+        <w:t xml:space="preserve"> </w:t>
+      </w:r>
+      <w:r>
+        <w:t xml:space="preserve">(accounts required; the instructor will provide guidance on access in Week 1)</w:t>
+      </w:r>
+      <w:r>
+        <w:t xml:space="preserve"> </w:t>
+      </w:r>
+      <w:r>
+        <w:t xml:space="preserve">- Claude and Claude Code: https://claude.ai · https://claude.com/claude-code</w:t>
+      </w:r>
+      <w:r>
+        <w:t xml:space="preserve"> </w:t>
+      </w:r>
+      <w:r>
+        <w:t xml:space="preserve">- Anthropic API: https://docs.anthropic.com</w:t>
+      </w:r>
+      <w:r>
+        <w:t xml:space="preserve"> </w:t>
+      </w:r>
+      <w:r>
+        <w:t xml:space="preserve">- OpenAI API and Codex: https://platform.openai.com</w:t>
+      </w:r>
+      <w:r>
+        <w:t xml:space="preserve"> </w:t>
+      </w:r>
+      <w:r>
+        <w:t xml:space="preserve">- Cursor: https://cursor.com</w:t>
+      </w:r>
+    </w:p>
+    <w:p>
+      <w:pPr>
+        <w:pStyle w:val="BodyText"/>
+      </w:pPr>
+      <w:r>
+        <w:rPr>
+          <w:bCs/>
+          <w:b/>
+        </w:rPr>
+        <w:t xml:space="preserve">Statistical packages for generated-variable inference</w:t>
+      </w:r>
+      <w:r>
+        <w:t xml:space="preserve"> </w:t>
+      </w:r>
+      <w:r>
+        <w:t xml:space="preserve">-</w:t>
+      </w:r>
+      <w:r>
+        <w:t xml:space="preserve"> </w:t>
+      </w:r>
+      <w:r>
+        <w:rPr>
+          <w:rStyle w:val="VerbatimChar"/>
+        </w:rPr>
+        <w:t xml:space="preserve">dsl</w:t>
+      </w:r>
+      <w:r>
+        <w:t xml:space="preserve"> </w:t>
+      </w:r>
+      <w:r>
+        <w:t xml:space="preserve">(design-based supervised learning, R): https://naokiegami.com/dsl/</w:t>
+      </w:r>
+      <w:r>
+        <w:t xml:space="preserve"> </w:t>
+      </w:r>
+      <w:r>
+        <w:t xml:space="preserve">-</w:t>
+      </w:r>
+      <w:r>
+        <w:t xml:space="preserve"> </w:t>
+      </w:r>
+      <w:r>
+        <w:rPr>
+          <w:rStyle w:val="VerbatimChar"/>
+        </w:rPr>
+        <w:t xml:space="preserve">ppi_py</w:t>
+      </w:r>
+      <w:r>
+        <w:t xml:space="preserve"> </w:t>
+      </w:r>
+      <w:r>
+        <w:t xml:space="preserve">(prediction-powered inference, Python): https://github.com/aangelopoulos/ppi_py</w:t>
+      </w:r>
+    </w:p>
+    <w:p>
+      <w:r>
+        <w:pict>
+          <v:rect style="width:0;height:1.5pt" o:hralign="center" o:hrstd="t" o:hr="t"/>
+        </w:pict>
+      </w:r>
+    </w:p>
+    <w:bookmarkEnd w:id="43"/>
+    <w:bookmarkStart w:id="44" w:name="course-notes-and-attendance"/>
+    <w:p>
+      <w:pPr>
+        <w:pStyle w:val="Heading2"/>
+      </w:pPr>
+      <w:r>
         <w:t xml:space="preserve">Course Notes and Attendance</w:t>
       </w:r>
     </w:p>
@@ -4932,8 +5380,8 @@
         <w:t xml:space="preserve">Attending class is an important part of learning. Your understanding of the course materials will be at a different level if you participate in the classes. It is the responsibility of the student to make up for missed lectures and discussion sections by meeting with a classmate to review what was discussed on the missed day, and by asking the professor questions during office hours regarding missed material.</w:t>
       </w:r>
     </w:p>
-    <w:bookmarkEnd w:id="43"/>
-    <w:bookmarkStart w:id="44" w:name="grading-policies"/>
+    <w:bookmarkEnd w:id="44"/>
+    <w:bookmarkStart w:id="45" w:name="grading-policies"/>
     <w:p>
       <w:pPr>
         <w:pStyle w:val="Heading2"/>
@@ -5629,9 +6077,9 @@
         </w:pict>
       </w:r>
     </w:p>
-    <w:bookmarkEnd w:id="44"/>
     <w:bookmarkEnd w:id="45"/>
-    <w:bookmarkStart w:id="54" w:name="marshall-guidelines"/>
+    <w:bookmarkEnd w:id="46"/>
+    <w:bookmarkStart w:id="55" w:name="marshall-guidelines"/>
     <w:p>
       <w:pPr>
         <w:pStyle w:val="Heading1"/>
@@ -5640,7 +6088,7 @@
         <w:t xml:space="preserve">MARSHALL GUIDELINES</w:t>
       </w:r>
     </w:p>
-    <w:bookmarkStart w:id="46" w:name="adddrop-process"/>
+    <w:bookmarkStart w:id="47" w:name="adddrop-process"/>
     <w:p>
       <w:pPr>
         <w:pStyle w:val="Heading2"/>
@@ -5701,8 +6149,8 @@
         <w:t xml:space="preserve">on your transcript.</w:t>
       </w:r>
     </w:p>
-    <w:bookmarkEnd w:id="46"/>
-    <w:bookmarkStart w:id="47" w:name="use-of-ai-generators"/>
+    <w:bookmarkEnd w:id="47"/>
+    <w:bookmarkStart w:id="48" w:name="use-of-ai-generators"/>
     <w:p>
       <w:pPr>
         <w:pStyle w:val="Heading2"/>
@@ -5869,8 +6317,8 @@
         <w:t xml:space="preserve">For the second half of the course, please follow the guidance provided by Professor Chen.</w:t>
       </w:r>
     </w:p>
-    <w:bookmarkEnd w:id="47"/>
-    <w:bookmarkStart w:id="48" w:name="academic-conduct"/>
+    <w:bookmarkEnd w:id="48"/>
+    <w:bookmarkStart w:id="49" w:name="academic-conduct"/>
     <w:p>
       <w:pPr>
         <w:pStyle w:val="Heading2"/>
@@ -5905,8 +6353,8 @@
         <w:t xml:space="preserve">policy.usc.edu/scampus-part-b. Other forms of academic dishonesty are equally unacceptable. See additional information in SCampus and university policies on Research and Scholarship Misconduct.</w:t>
       </w:r>
     </w:p>
-    <w:bookmarkEnd w:id="48"/>
-    <w:bookmarkStart w:id="49" w:name="students-and-disability-accommodations"/>
+    <w:bookmarkEnd w:id="49"/>
+    <w:bookmarkStart w:id="50" w:name="students-and-disability-accommodations"/>
     <w:p>
       <w:pPr>
         <w:pStyle w:val="Heading2"/>
@@ -5923,8 +6371,8 @@
         <w:t xml:space="preserve">USC welcomes students with disabilities into all of the University’s educational programs. The Office of Student Accessibility Services (OSAS) is responsible for the determination of appropriate accommodations for students who encounter disability-related barriers. Once a student has completed the OSAS process (registration, initial appointment, and submitted documentation) and accommodations are determined to be reasonable and appropriate, a Letter of Accommodation (LOA) will be available to generate for each course. The LOA must be given to each course instructor by the student and followed up with a discussion. This should be done as early in the semester as possible as accommodations are not retroactive. More information can be found at osas.usc.edu. You may contact OSAS at (213) 740-0776 or via email at osasfrontdesk@usc.edu.</w:t>
       </w:r>
     </w:p>
-    <w:bookmarkEnd w:id="49"/>
-    <w:bookmarkStart w:id="50" w:name="X1210a6be8876095c643b5d9ecf425a282a9ba83"/>
+    <w:bookmarkEnd w:id="50"/>
+    <w:bookmarkStart w:id="51" w:name="X1210a6be8876095c643b5d9ecf425a282a9ba83"/>
     <w:p>
       <w:pPr>
         <w:pStyle w:val="Heading2"/>
@@ -5941,8 +6389,8 @@
         <w:t xml:space="preserve">To be eligible for certain kinds of financial aid, students are required to maintain Satisfactory Academic Progress (SAP) toward their degree objectives. Visit the Financial Aid Office webpage for undergraduate- and graduate-level SAP eligibility requirements and the appeals process.</w:t>
       </w:r>
     </w:p>
-    <w:bookmarkEnd w:id="50"/>
-    <w:bookmarkStart w:id="51" w:name="support-systems"/>
+    <w:bookmarkEnd w:id="51"/>
+    <w:bookmarkStart w:id="52" w:name="support-systems"/>
     <w:p>
       <w:pPr>
         <w:pStyle w:val="Heading2"/>
@@ -6209,8 +6657,8 @@
         <w:t xml:space="preserve">Confidential Lifestyle Redesign services for USC students to support health promoting habits and routines that enhance quality of life and academic performance.</w:t>
       </w:r>
     </w:p>
-    <w:bookmarkEnd w:id="51"/>
-    <w:bookmarkStart w:id="52" w:name="emergency-preparednesscourse-continuity"/>
+    <w:bookmarkEnd w:id="52"/>
+    <w:bookmarkStart w:id="53" w:name="emergency-preparednesscourse-continuity"/>
     <w:p>
       <w:pPr>
         <w:pStyle w:val="Heading2"/>
@@ -6235,8 +6683,8 @@
         <w:t xml:space="preserve">Please access our course site on Blackboard, where the course syllabus and many other important documents will be posted. Whether or not you use Blackboard regularly, these preparations will be crucial in an emergency. USC’s Blackboard learning management system and support information is available at blackboard.usc.edu.</w:t>
       </w:r>
     </w:p>
-    <w:bookmarkEnd w:id="52"/>
-    <w:bookmarkStart w:id="53" w:name="incomplete-grades"/>
+    <w:bookmarkEnd w:id="53"/>
+    <w:bookmarkStart w:id="54" w:name="incomplete-grades"/>
     <w:p>
       <w:pPr>
         <w:pStyle w:val="Heading2"/>
@@ -6315,8 +6763,8 @@
         <w:t xml:space="preserve">form which specifies to the student and to the department the work remaining to be done, the procedures for its completion, the grade in the course to date, and the weight to be assigned to work remaining to be done when the final grade is computed. Both the instructor and student must sign the form with a copy of the form filed in the department. Class work to complete the course must be completed within one calendar year from the date the IN was assigned. The IN mark will be converted to an F grade should the course not be completed within the time allowed.</w:t>
       </w:r>
     </w:p>
-    <w:bookmarkEnd w:id="53"/>
     <w:bookmarkEnd w:id="54"/>
+    <w:bookmarkEnd w:id="55"/>
     <w:sectPr/>
   </w:body>
 </w:document>

</xml_diff>

<commit_message>
Milestones: assign in class, due before the next class
The tables in the syllabus, README, and Lectures 1-2 dated each milestone
on its own class day, so the Week 4 measurement milestone was due the day
measurement was first taught, and the Week 3 data milestone on the data
lecture. The end-of-lecture slides in Weeks 4-6 already said "due before
next class". Realign the tables to the slides with Assigned and Due
columns: Weeks 3-6 are now due Sep 16, 23, 30, and Oct 7.

Corrected estimates move from the Week 6 row to Week 5, matching the
Lecture 5 slide; Week 6 is the revised identification memo and the
robustness plan. Lecture 3 states the rule on its milestone slide.

Rebuild the Word syllabus. The black-heading pandoc reference doc and a
Makefile now live in syllabus/ so the build is reproducible.

Co-Authored-By: Claude Fable 5.1 <noreply@anthropic.com>
</commit_message>
<xml_diff>
--- a/syllabus/mkt-699-Fall2026-revised.docx
+++ b/syllabus/mkt-699-Fall2026-revised.docx
@@ -1987,6 +1987,12 @@
           <w:b/>
         </w:rPr>
         <w:t xml:space="preserve">Milestones.</w:t>
+      </w:r>
+      <w:r>
+        <w:t xml:space="preserve"> </w:t>
+      </w:r>
+      <w:r>
+        <w:t xml:space="preserve">Each milestone is assigned in class and is due, committed to the project repository, before the class on its due date.</w:t>
       </w:r>
     </w:p>
     <w:tbl>
@@ -1997,9 +2003,10 @@
         <w:jc w:val="start"/>
       </w:tblPr>
       <w:tblGrid>
-        <w:gridCol w:w="2640"/>
-        <w:gridCol w:w="2640"/>
-        <w:gridCol w:w="2640"/>
+        <w:gridCol w:w="1980"/>
+        <w:gridCol w:w="1980"/>
+        <w:gridCol w:w="1980"/>
+        <w:gridCol w:w="1980"/>
       </w:tblGrid>
       <w:tr>
         <w:trPr>
@@ -2025,7 +2032,19 @@
               <w:jc w:val="left"/>
             </w:pPr>
             <w:r>
-              <w:t xml:space="preserve">Date</w:t>
+              <w:t xml:space="preserve">Assigned</w:t>
+            </w:r>
+          </w:p>
+        </w:tc>
+        <w:tc>
+          <w:tcPr/>
+          <w:p>
+            <w:pPr>
+              <w:pStyle w:val="Compact"/>
+              <w:jc w:val="left"/>
+            </w:pPr>
+            <w:r>
+              <w:t xml:space="preserve">Due</w:t>
             </w:r>
           </w:p>
         </w:tc>
@@ -2075,6 +2094,18 @@
               <w:jc w:val="left"/>
             </w:pPr>
             <w:r>
+              <w:t xml:space="preserve">Aug 26 (in class)</w:t>
+            </w:r>
+          </w:p>
+        </w:tc>
+        <w:tc>
+          <w:tcPr/>
+          <w:p>
+            <w:pPr>
+              <w:pStyle w:val="Compact"/>
+              <w:jc w:val="left"/>
+            </w:pPr>
+            <w:r>
               <w:t xml:space="preserve">Repository initialized</w:t>
             </w:r>
           </w:p>
@@ -2101,6 +2132,18 @@
               <w:jc w:val="left"/>
             </w:pPr>
             <w:r>
+              <w:t xml:space="preserve">Aug 26</w:t>
+            </w:r>
+          </w:p>
+        </w:tc>
+        <w:tc>
+          <w:tcPr/>
+          <w:p>
+            <w:pPr>
+              <w:pStyle w:val="Compact"/>
+              <w:jc w:val="left"/>
+            </w:pPr>
+            <w:r>
               <w:t xml:space="preserve">Sep 2</w:t>
             </w:r>
           </w:p>
@@ -2140,6 +2183,18 @@
             </w:pPr>
             <w:r>
               <w:t xml:space="preserve">Sep 9</w:t>
+            </w:r>
+          </w:p>
+        </w:tc>
+        <w:tc>
+          <w:tcPr/>
+          <w:p>
+            <w:pPr>
+              <w:pStyle w:val="Compact"/>
+              <w:jc w:val="left"/>
+            </w:pPr>
+            <w:r>
+              <w:t xml:space="preserve">Sep 16</w:t>
             </w:r>
           </w:p>
         </w:tc>
@@ -2199,6 +2254,18 @@
               <w:jc w:val="left"/>
             </w:pPr>
             <w:r>
+              <w:t xml:space="preserve">Sep 23</w:t>
+            </w:r>
+          </w:p>
+        </w:tc>
+        <w:tc>
+          <w:tcPr/>
+          <w:p>
+            <w:pPr>
+              <w:pStyle w:val="Compact"/>
+              <w:jc w:val="left"/>
+            </w:pPr>
+            <w:r>
               <w:t xml:space="preserve">Measurement approach specified; prompt and model documented; validation sample designed</w:t>
             </w:r>
           </w:p>
@@ -2237,7 +2304,19 @@
               <w:jc w:val="left"/>
             </w:pPr>
             <w:r>
-              <w:t xml:space="preserve">Validation complete; naive estimates reported</w:t>
+              <w:t xml:space="preserve">Sep 30</w:t>
+            </w:r>
+          </w:p>
+        </w:tc>
+        <w:tc>
+          <w:tcPr/>
+          <w:p>
+            <w:pPr>
+              <w:pStyle w:val="Compact"/>
+              <w:jc w:val="left"/>
+            </w:pPr>
+            <w:r>
+              <w:t xml:space="preserve">Validation complete; naive and corrected estimates reported side by side</w:t>
             </w:r>
           </w:p>
         </w:tc>
@@ -2275,7 +2354,19 @@
               <w:jc w:val="left"/>
             </w:pPr>
             <w:r>
-              <w:t xml:space="preserve">Corrected estimates reported; identification argument revised; robustness plan</w:t>
+              <w:t xml:space="preserve">Oct 7</w:t>
+            </w:r>
+          </w:p>
+        </w:tc>
+        <w:tc>
+          <w:tcPr/>
+          <w:p>
+            <w:pPr>
+              <w:pStyle w:val="Compact"/>
+              <w:jc w:val="left"/>
+            </w:pPr>
+            <w:r>
+              <w:t xml:space="preserve">Identification argument revised; robustness plan</w:t>
             </w:r>
           </w:p>
         </w:tc>
@@ -2298,6 +2389,14 @@
           <w:p>
             <w:pPr>
               <w:pStyle w:val="Compact"/>
+            </w:pPr>
+          </w:p>
+        </w:tc>
+        <w:tc>
+          <w:tcPr/>
+          <w:p>
+            <w:pPr>
+              <w:pStyle w:val="Compact"/>
               <w:jc w:val="left"/>
             </w:pPr>
             <w:r>
@@ -2352,7 +2451,7 @@
         <w:t xml:space="preserve"> </w:t>
       </w:r>
       <w:r>
-        <w:t xml:space="preserve">The Week 6 deliverable revisits the Week 3 memo in light of the validation study, and is due with the corrected estimates. The question it answers is whether measurement error changed what you are willing to claim. Mark changes from the Week 3 version so the revision is legible as a revision.</w:t>
+        <w:t xml:space="preserve">The Week 6 deliverable revisits the Week 3 memo in light of the validation study and the corrected estimates from Week 5. The question it answers is whether measurement error changed what you are willing to claim. Mark changes from the Week 3 version so the revision is legible as a revision.</w:t>
       </w:r>
     </w:p>
     <w:p>
@@ -7203,7 +7302,7 @@
       <w:rFonts w:asciiTheme="majorHAnsi" w:cstheme="majorBidi" w:eastAsiaTheme="majorEastAsia" w:hAnsiTheme="majorHAnsi"/>
       <w:b/>
       <w:bCs/>
-      <w:color w:themeColor="accent1" w:themeShade="B5" w:val="345A8A"/>
+      <w:color w:val="000000"/>
       <w:sz w:val="36"/>
       <w:szCs w:val="36"/>
     </w:rPr>
@@ -7220,6 +7319,7 @@
       <w:jc w:val="center"/>
     </w:pPr>
     <w:rPr>
+      <w:color w:val="000000"/>
       <w:sz w:val="30"/>
       <w:szCs w:val="30"/>
     </w:rPr>
@@ -7259,7 +7359,7 @@
       <w:sz w:val="20"/>
       <w:szCs w:val="20"/>
       <w:b/>
-      <w:color w:val="345A8A"/>
+      <w:color w:val="000000"/>
       &gt;
     </w:rPr>
   </w:style>
@@ -7302,7 +7402,7 @@
       <w:rFonts w:asciiTheme="majorHAnsi" w:cstheme="majorBidi" w:eastAsiaTheme="majorEastAsia" w:hAnsiTheme="majorHAnsi"/>
       <w:b/>
       <w:bCs/>
-      <w:color w:themeColor="accent1" w:val="4F81BD"/>
+      <w:color w:val="000000"/>
       <w:sz w:val="32"/>
       <w:szCs w:val="32"/>
     </w:rPr>
@@ -7324,7 +7424,7 @@
       <w:rFonts w:asciiTheme="majorHAnsi" w:cstheme="majorBidi" w:eastAsiaTheme="majorEastAsia" w:hAnsiTheme="majorHAnsi"/>
       <w:b/>
       <w:bCs/>
-      <w:color w:themeColor="accent1" w:val="4F81BD"/>
+      <w:color w:val="000000"/>
       <w:sz w:val="28"/>
       <w:szCs w:val="28"/>
     </w:rPr>
@@ -7346,7 +7446,7 @@
       <w:rFonts w:asciiTheme="majorHAnsi" w:cstheme="majorBidi" w:eastAsiaTheme="majorEastAsia" w:hAnsiTheme="majorHAnsi"/>
       <w:b/>
       <w:bCs/>
-      <w:color w:themeColor="accent1" w:val="4F81BD"/>
+      <w:color w:val="000000"/>
       <w:sz w:val="24"/>
       <w:szCs w:val="24"/>
     </w:rPr>
@@ -7368,7 +7468,7 @@
       <w:rFonts w:asciiTheme="majorHAnsi" w:cstheme="majorBidi" w:eastAsiaTheme="majorEastAsia" w:hAnsiTheme="majorHAnsi"/>
       <w:i/>
       <w:bCs/>
-      <w:color w:themeColor="accent1" w:val="4F81BD"/>
+      <w:color w:val="000000"/>
       <w:sz w:val="24"/>
       <w:szCs w:val="24"/>
     </w:rPr>
@@ -7389,7 +7489,7 @@
     <w:rPr>
       <w:rFonts w:asciiTheme="majorHAnsi" w:cstheme="majorBidi" w:eastAsiaTheme="majorEastAsia" w:hAnsiTheme="majorHAnsi"/>
       <w:iCs/>
-      <w:color w:themeColor="accent1" w:val="4F81BD"/>
+      <w:color w:val="000000"/>
       <w:sz w:val="24"/>
       <w:szCs w:val="24"/>
     </w:rPr>
@@ -7409,7 +7509,7 @@
     </w:pPr>
     <w:rPr>
       <w:rFonts w:asciiTheme="majorHAnsi" w:cstheme="majorBidi" w:eastAsiaTheme="majorEastAsia" w:hAnsiTheme="majorHAnsi"/>
-      <w:color w:themeColor="accent1" w:val="4F81BD"/>
+      <w:color w:val="000000"/>
       <w:sz w:val="24"/>
       <w:szCs w:val="24"/>
     </w:rPr>
@@ -7429,7 +7529,7 @@
     </w:pPr>
     <w:rPr>
       <w:rFonts w:asciiTheme="majorHAnsi" w:cstheme="majorBidi" w:eastAsiaTheme="majorEastAsia" w:hAnsiTheme="majorHAnsi"/>
-      <w:color w:themeColor="accent1" w:val="4F81BD"/>
+      <w:color w:val="000000"/>
       <w:sz w:val="24"/>
       <w:szCs w:val="24"/>
     </w:rPr>
@@ -7449,7 +7549,7 @@
     </w:pPr>
     <w:rPr>
       <w:rFonts w:asciiTheme="majorHAnsi" w:cstheme="majorBidi" w:eastAsiaTheme="majorEastAsia" w:hAnsiTheme="majorHAnsi"/>
-      <w:color w:themeColor="accent1" w:val="4F81BD"/>
+      <w:color w:val="000000"/>
       <w:sz w:val="24"/>
       <w:szCs w:val="24"/>
     </w:rPr>
@@ -7469,7 +7569,7 @@
     </w:pPr>
     <w:rPr>
       <w:rFonts w:asciiTheme="majorHAnsi" w:cstheme="majorBidi" w:eastAsiaTheme="majorEastAsia" w:hAnsiTheme="majorHAnsi"/>
-      <w:color w:themeColor="accent1" w:val="4F81BD"/>
+      <w:color w:val="000000"/>
       <w:sz w:val="24"/>
       <w:szCs w:val="24"/>
     </w:rPr>
@@ -7608,7 +7708,7 @@
     <w:name w:val="Hyperlink"/>
     <w:basedOn w:val="BodyTextChar"/>
     <w:rPr>
-      <w:color w:themeColor="accent1" w:val="4F81BD"/>
+      <w:color w:val="000000"/>
     </w:rPr>
   </w:style>
   <w:style w:styleId="TOCHeading" w:type="paragraph">
@@ -7641,7 +7741,6 @@
     <w:name w:val="KeywordTok"/>
     <w:basedOn w:val="VerbatimChar"/>
     <w:rPr>
-      <w:color w:val="007020"/>
       <w:b/>
     </w:rPr>
   </w:style>
@@ -7649,85 +7748,63 @@
     <w:name w:val="DataTypeTok"/>
     <w:basedOn w:val="VerbatimChar"/>
     <w:rPr>
-      <w:color w:val="902000"/>
+      <w:u/>
     </w:rPr>
   </w:style>
   <w:style w:type="character" w:customStyle="1" w:styleId="DecValTok">
     <w:name w:val="DecValTok"/>
     <w:basedOn w:val="VerbatimChar"/>
-    <w:rPr>
-      <w:color w:val="40a070"/>
-    </w:rPr>
+    <w:rPr/>
   </w:style>
   <w:style w:type="character" w:customStyle="1" w:styleId="BaseNTok">
     <w:name w:val="BaseNTok"/>
     <w:basedOn w:val="VerbatimChar"/>
-    <w:rPr>
-      <w:color w:val="40a070"/>
-    </w:rPr>
+    <w:rPr/>
   </w:style>
   <w:style w:type="character" w:customStyle="1" w:styleId="FloatTok">
     <w:name w:val="FloatTok"/>
     <w:basedOn w:val="VerbatimChar"/>
-    <w:rPr>
-      <w:color w:val="40a070"/>
-    </w:rPr>
+    <w:rPr/>
   </w:style>
   <w:style w:type="character" w:customStyle="1" w:styleId="ConstantTok">
     <w:name w:val="ConstantTok"/>
     <w:basedOn w:val="VerbatimChar"/>
-    <w:rPr>
-      <w:color w:val="880000"/>
-    </w:rPr>
+    <w:rPr/>
   </w:style>
   <w:style w:type="character" w:customStyle="1" w:styleId="CharTok">
     <w:name w:val="CharTok"/>
     <w:basedOn w:val="VerbatimChar"/>
-    <w:rPr>
-      <w:color w:val="4070a0"/>
-    </w:rPr>
+    <w:rPr/>
   </w:style>
   <w:style w:type="character" w:customStyle="1" w:styleId="SpecialCharTok">
     <w:name w:val="SpecialCharTok"/>
     <w:basedOn w:val="VerbatimChar"/>
-    <w:rPr>
-      <w:color w:val="4070a0"/>
-    </w:rPr>
+    <w:rPr/>
   </w:style>
   <w:style w:type="character" w:customStyle="1" w:styleId="StringTok">
     <w:name w:val="StringTok"/>
     <w:basedOn w:val="VerbatimChar"/>
-    <w:rPr>
-      <w:color w:val="4070a0"/>
-    </w:rPr>
+    <w:rPr/>
   </w:style>
   <w:style w:type="character" w:customStyle="1" w:styleId="VerbatimStringTok">
     <w:name w:val="VerbatimStringTok"/>
     <w:basedOn w:val="VerbatimChar"/>
-    <w:rPr>
-      <w:color w:val="4070a0"/>
-    </w:rPr>
+    <w:rPr/>
   </w:style>
   <w:style w:type="character" w:customStyle="1" w:styleId="SpecialStringTok">
     <w:name w:val="SpecialStringTok"/>
     <w:basedOn w:val="VerbatimChar"/>
-    <w:rPr>
-      <w:color w:val="bb6688"/>
-    </w:rPr>
+    <w:rPr/>
   </w:style>
   <w:style w:type="character" w:customStyle="1" w:styleId="ImportTok">
     <w:name w:val="ImportTok"/>
     <w:basedOn w:val="VerbatimChar"/>
-    <w:rPr>
-      <w:color w:val="008000"/>
-      <w:b/>
-    </w:rPr>
+    <w:rPr/>
   </w:style>
   <w:style w:type="character" w:customStyle="1" w:styleId="CommentTok">
     <w:name w:val="CommentTok"/>
     <w:basedOn w:val="VerbatimChar"/>
     <w:rPr>
-      <w:color w:val="60a0b0"/>
       <w:i/>
     </w:rPr>
   </w:style>
@@ -7735,7 +7812,6 @@
     <w:name w:val="DocumentationTok"/>
     <w:basedOn w:val="VerbatimChar"/>
     <w:rPr>
-      <w:color w:val="ba2121"/>
       <w:i/>
     </w:rPr>
   </w:style>
@@ -7743,8 +7819,6 @@
     <w:name w:val="AnnotationTok"/>
     <w:basedOn w:val="VerbatimChar"/>
     <w:rPr>
-      <w:color w:val="60a0b0"/>
-      <w:b/>
       <w:i/>
     </w:rPr>
   </w:style>
@@ -7752,53 +7826,40 @@
     <w:name w:val="CommentVarTok"/>
     <w:basedOn w:val="VerbatimChar"/>
     <w:rPr>
-      <w:color w:val="60a0b0"/>
-      <w:b/>
       <w:i/>
     </w:rPr>
   </w:style>
   <w:style w:type="character" w:customStyle="1" w:styleId="OtherTok">
     <w:name w:val="OtherTok"/>
     <w:basedOn w:val="VerbatimChar"/>
-    <w:rPr>
-      <w:color w:val="007020"/>
-    </w:rPr>
+    <w:rPr/>
   </w:style>
   <w:style w:type="character" w:customStyle="1" w:styleId="FunctionTok">
     <w:name w:val="FunctionTok"/>
     <w:basedOn w:val="VerbatimChar"/>
-    <w:rPr>
-      <w:color w:val="06287e"/>
-    </w:rPr>
+    <w:rPr/>
   </w:style>
   <w:style w:type="character" w:customStyle="1" w:styleId="VariableTok">
     <w:name w:val="VariableTok"/>
     <w:basedOn w:val="VerbatimChar"/>
-    <w:rPr>
-      <w:color w:val="19177c"/>
-    </w:rPr>
+    <w:rPr/>
   </w:style>
   <w:style w:type="character" w:customStyle="1" w:styleId="ControlFlowTok">
     <w:name w:val="ControlFlowTok"/>
     <w:basedOn w:val="VerbatimChar"/>
     <w:rPr>
-      <w:color w:val="007020"/>
       <w:b/>
     </w:rPr>
   </w:style>
   <w:style w:type="character" w:customStyle="1" w:styleId="OperatorTok">
     <w:name w:val="OperatorTok"/>
     <w:basedOn w:val="VerbatimChar"/>
-    <w:rPr>
-      <w:color w:val="666666"/>
-    </w:rPr>
+    <w:rPr/>
   </w:style>
   <w:style w:type="character" w:customStyle="1" w:styleId="BuiltInTok">
     <w:name w:val="BuiltInTok"/>
     <w:basedOn w:val="VerbatimChar"/>
-    <w:rPr>
-      <w:color w:val="008000"/>
-    </w:rPr>
+    <w:rPr/>
   </w:style>
   <w:style w:type="character" w:customStyle="1" w:styleId="ExtensionTok">
     <w:name w:val="ExtensionTok"/>
@@ -7809,15 +7870,13 @@
     <w:name w:val="PreprocessorTok"/>
     <w:basedOn w:val="VerbatimChar"/>
     <w:rPr>
-      <w:color w:val="bc7a00"/>
+      <w:b/>
     </w:rPr>
   </w:style>
   <w:style w:type="character" w:customStyle="1" w:styleId="AttributeTok">
     <w:name w:val="AttributeTok"/>
     <w:basedOn w:val="VerbatimChar"/>
-    <w:rPr>
-      <w:color w:val="7d9029"/>
-    </w:rPr>
+    <w:rPr/>
   </w:style>
   <w:style w:type="character" w:customStyle="1" w:styleId="RegionMarkerTok">
     <w:name w:val="RegionMarkerTok"/>
@@ -7828,8 +7887,6 @@
     <w:name w:val="InformationTok"/>
     <w:basedOn w:val="VerbatimChar"/>
     <w:rPr>
-      <w:color w:val="60a0b0"/>
-      <w:b/>
       <w:i/>
     </w:rPr>
   </w:style>
@@ -7837,8 +7894,6 @@
     <w:name w:val="WarningTok"/>
     <w:basedOn w:val="VerbatimChar"/>
     <w:rPr>
-      <w:color w:val="60a0b0"/>
-      <w:b/>
       <w:i/>
     </w:rPr>
   </w:style>
@@ -7846,7 +7901,6 @@
     <w:name w:val="AlertTok"/>
     <w:basedOn w:val="VerbatimChar"/>
     <w:rPr>
-      <w:color w:val="ff0000"/>
       <w:b/>
     </w:rPr>
   </w:style>
@@ -7854,7 +7908,6 @@
     <w:name w:val="ErrorTok"/>
     <w:basedOn w:val="VerbatimChar"/>
     <w:rPr>
-      <w:color w:val="ff0000"/>
       <w:b/>
     </w:rPr>
   </w:style>
@@ -7883,28 +7936,28 @@
         <a:srgbClr val="EEECE1"/>
       </a:lt2>
       <a:accent1>
-        <a:srgbClr val="4F81BD"/>
+        <a:srgbClr val="000000"/>
       </a:accent1>
       <a:accent2>
-        <a:srgbClr val="C0504D"/>
+        <a:srgbClr val="000000"/>
       </a:accent2>
       <a:accent3>
-        <a:srgbClr val="9BBB59"/>
+        <a:srgbClr val="000000"/>
       </a:accent3>
       <a:accent4>
-        <a:srgbClr val="8064A2"/>
+        <a:srgbClr val="000000"/>
       </a:accent4>
       <a:accent5>
-        <a:srgbClr val="4BACC6"/>
+        <a:srgbClr val="000000"/>
       </a:accent5>
       <a:accent6>
-        <a:srgbClr val="F79646"/>
+        <a:srgbClr val="000000"/>
       </a:accent6>
       <a:hlink>
-        <a:srgbClr val="0000FF"/>
+        <a:srgbClr val="000000"/>
       </a:hlink>
       <a:folHlink>
-        <a:srgbClr val="800080"/>
+        <a:srgbClr val="000000"/>
       </a:folHlink>
     </a:clrScheme>
     <a:fontScheme name="Office">

</xml_diff>